<commit_message>
Bo sung 5 quy trinh ho tro & chinh cac tu khoa
</commit_message>
<xml_diff>
--- a/DoAn_Final.docx
+++ b/DoAn_Final.docx
@@ -2330,8 +2330,6 @@
               </w:rPr>
               <w:tab/>
             </w:r>
-            <w:bookmarkStart w:id="1" w:name="_GoBack"/>
-            <w:bookmarkEnd w:id="1"/>
             <w:r>
               <w:rPr>
                 <w:noProof/>
@@ -2910,7 +2908,7 @@
       <w:pPr>
         <w:pStyle w:val="Heading1"/>
       </w:pPr>
-      <w:bookmarkStart w:id="2" w:name="_Toc236513283"/>
+      <w:bookmarkStart w:id="1" w:name="_Toc236513283"/>
       <w:r>
         <w:lastRenderedPageBreak/>
         <w:t>DANH SÁCH HÌNH</w:t>
@@ -2918,7 +2916,7 @@
       <w:r>
         <w:t>, BẢNG</w:t>
       </w:r>
-      <w:bookmarkEnd w:id="2"/>
+      <w:bookmarkEnd w:id="1"/>
     </w:p>
     <w:p>
       <w:pPr>
@@ -3234,7 +3232,7 @@
       <w:pPr>
         <w:pStyle w:val="Heading1"/>
       </w:pPr>
-      <w:bookmarkStart w:id="3" w:name="_Toc236513284"/>
+      <w:bookmarkStart w:id="2" w:name="_Toc236513284"/>
       <w:r>
         <w:t xml:space="preserve">Chương I. </w:t>
       </w:r>
@@ -3244,39 +3242,39 @@
       <w:r>
         <w:t>.</w:t>
       </w:r>
+      <w:bookmarkEnd w:id="2"/>
+    </w:p>
+    <w:p>
+      <w:pPr>
+        <w:pStyle w:val="Heading2"/>
+      </w:pPr>
+      <w:bookmarkStart w:id="3" w:name="_Toc236513285"/>
+      <w:r>
+        <w:t xml:space="preserve">1. </w:t>
+      </w:r>
+      <w:r>
+        <w:t>Giới thiệu</w:t>
+      </w:r>
+      <w:r>
+        <w:t xml:space="preserve"> đề tài</w:t>
+      </w:r>
+      <w:r>
+        <w:t>.</w:t>
+      </w:r>
       <w:bookmarkEnd w:id="3"/>
     </w:p>
     <w:p>
       <w:pPr>
-        <w:pStyle w:val="Heading2"/>
-      </w:pPr>
-      <w:bookmarkStart w:id="4" w:name="_Toc236513285"/>
-      <w:r>
-        <w:t xml:space="preserve">1. </w:t>
-      </w:r>
-      <w:r>
-        <w:t>Giới thiệu</w:t>
-      </w:r>
-      <w:r>
-        <w:t xml:space="preserve"> đề tài</w:t>
-      </w:r>
-      <w:r>
-        <w:t>.</w:t>
+        <w:pStyle w:val="Heading3"/>
+      </w:pPr>
+      <w:bookmarkStart w:id="4" w:name="_Toc236513286"/>
+      <w:r>
+        <w:t xml:space="preserve">1.1. </w:t>
+      </w:r>
+      <w:r>
+        <w:t>Lý do chọn đề tài</w:t>
       </w:r>
       <w:bookmarkEnd w:id="4"/>
-    </w:p>
-    <w:p>
-      <w:pPr>
-        <w:pStyle w:val="Heading3"/>
-      </w:pPr>
-      <w:bookmarkStart w:id="5" w:name="_Toc236513286"/>
-      <w:r>
-        <w:t xml:space="preserve">1.1. </w:t>
-      </w:r>
-      <w:r>
-        <w:t>Lý do chọn đề tài</w:t>
-      </w:r>
-      <w:bookmarkEnd w:id="5"/>
     </w:p>
     <w:p>
       <w:pPr>
@@ -3333,7 +3331,7 @@
       <w:pPr>
         <w:pStyle w:val="Heading3"/>
       </w:pPr>
-      <w:bookmarkStart w:id="6" w:name="_Toc236513287"/>
+      <w:bookmarkStart w:id="5" w:name="_Toc236513287"/>
       <w:r>
         <w:t>1.2</w:t>
       </w:r>
@@ -3343,7 +3341,7 @@
       <w:r>
         <w:t xml:space="preserve"> Mục tiêu nghiên cứu</w:t>
       </w:r>
-      <w:bookmarkEnd w:id="6"/>
+      <w:bookmarkEnd w:id="5"/>
     </w:p>
     <w:p>
       <w:pPr>
@@ -3428,14 +3426,14 @@
       <w:pPr>
         <w:pStyle w:val="Heading3"/>
       </w:pPr>
-      <w:bookmarkStart w:id="7" w:name="_Toc236513288"/>
+      <w:bookmarkStart w:id="6" w:name="_Toc236513288"/>
       <w:r>
         <w:t xml:space="preserve">1.3. </w:t>
       </w:r>
       <w:r>
         <w:t>Đối tượng và phạm vi nghiêm cứu</w:t>
       </w:r>
-      <w:bookmarkEnd w:id="7"/>
+      <w:bookmarkEnd w:id="6"/>
     </w:p>
     <w:p>
       <w:pPr>
@@ -3463,7 +3461,13 @@
         <w:t xml:space="preserve"> Q</w:t>
       </w:r>
       <w:r>
-        <w:t>uy trình giải quyết thủ tục hành chính tại Ủy ban nhân dân (UBND) và hệ thống thông tin hỗ trợ quản lý các quy trình này. Đồ án tập trung nghiên cứu các hoạt động tiếp nhận, kiểm tra, xử lý, phê duyệt và trả kết quả hồ sơ hành chính giữa người dân và UBND, đồng thời phân tích luồng công việc, luồng thông tin và các tác nhân tham gia trong quá trình giải quyết thủ tục hành chính.</w:t>
+        <w:t xml:space="preserve">uy trình giải quyết thủ tục hành chính tại </w:t>
+      </w:r>
+      <w:r>
+        <w:t xml:space="preserve">địa phương </w:t>
+      </w:r>
+      <w:r>
+        <w:t>và hệ thống thông tin hỗ trợ quản lý các quy trình này. Đồ án tập trung nghiên cứu các hoạt động tiếp nhận, kiểm tra, xử lý, phê duyệt và trả kết quả hồ sơ hành chính giữa người dân và UBND, đồng thời phân tích luồng công việc, luồng thông tin và các tác nhân tham gia trong quá trình giải quyết thủ tục hành chính.</w:t>
       </w:r>
     </w:p>
     <w:p>
@@ -3495,11 +3499,11 @@
       <w:pPr>
         <w:pStyle w:val="Heading3"/>
       </w:pPr>
-      <w:bookmarkStart w:id="8" w:name="_Toc236513289"/>
+      <w:bookmarkStart w:id="7" w:name="_Toc236513289"/>
       <w:r>
         <w:t>1.4. Phương pháp nghiên cứu</w:t>
       </w:r>
-      <w:bookmarkEnd w:id="8"/>
+      <w:bookmarkEnd w:id="7"/>
     </w:p>
     <w:p>
       <w:pPr>
@@ -3570,11 +3574,11 @@
       <w:pPr>
         <w:pStyle w:val="Heading3"/>
       </w:pPr>
-      <w:bookmarkStart w:id="9" w:name="_Toc236513290"/>
+      <w:bookmarkStart w:id="8" w:name="_Toc236513290"/>
       <w:r>
         <w:t>1.5. Cấu trúc đồ án</w:t>
       </w:r>
-      <w:bookmarkEnd w:id="9"/>
+      <w:bookmarkEnd w:id="8"/>
     </w:p>
     <w:p>
       <w:pPr>
@@ -3668,12 +3672,12 @@
       <w:pPr>
         <w:pStyle w:val="Heading2"/>
       </w:pPr>
-      <w:bookmarkStart w:id="10" w:name="_Toc236513291"/>
+      <w:bookmarkStart w:id="9" w:name="_Toc236513291"/>
       <w:r>
         <w:lastRenderedPageBreak/>
         <w:t>2. Cơ sở lý thuyết.</w:t>
       </w:r>
-      <w:bookmarkEnd w:id="10"/>
+      <w:bookmarkEnd w:id="9"/>
     </w:p>
     <w:p>
       <w:pPr>
@@ -3753,8 +3757,8 @@
       <w:pPr>
         <w:pStyle w:val="Heading1"/>
       </w:pPr>
-      <w:bookmarkStart w:id="11" w:name="_Toc236264118"/>
-      <w:bookmarkStart w:id="12" w:name="_Toc236513292"/>
+      <w:bookmarkStart w:id="10" w:name="_Toc236264118"/>
+      <w:bookmarkStart w:id="11" w:name="_Toc236513292"/>
       <w:r>
         <w:lastRenderedPageBreak/>
         <w:t>Chương II.</w:t>
@@ -3774,50 +3778,50 @@
       <w:r>
         <w:t>.</w:t>
       </w:r>
+      <w:bookmarkEnd w:id="10"/>
       <w:bookmarkEnd w:id="11"/>
+    </w:p>
+    <w:p>
+      <w:pPr>
+        <w:pStyle w:val="Heading2"/>
+      </w:pPr>
+      <w:bookmarkStart w:id="12" w:name="_Toc236264119"/>
+      <w:bookmarkStart w:id="13" w:name="_Toc236513293"/>
+      <w:r>
+        <w:t>2. Tổng quan hệ thống quy trình nghiệp vụ</w:t>
+      </w:r>
       <w:bookmarkEnd w:id="12"/>
-    </w:p>
-    <w:p>
-      <w:pPr>
-        <w:pStyle w:val="Heading2"/>
-      </w:pPr>
-      <w:bookmarkStart w:id="13" w:name="_Toc236264119"/>
-      <w:bookmarkStart w:id="14" w:name="_Toc236513293"/>
-      <w:r>
-        <w:t>2. Tổng quan hệ thống quy trình nghiệp vụ</w:t>
-      </w:r>
       <w:bookmarkEnd w:id="13"/>
+    </w:p>
+    <w:p>
+      <w:pPr>
+        <w:pStyle w:val="Heading3"/>
+      </w:pPr>
+      <w:bookmarkStart w:id="14" w:name="_Toc236264120"/>
+      <w:bookmarkStart w:id="15" w:name="_Toc236513294"/>
+      <w:r>
+        <w:t xml:space="preserve">2.1. </w:t>
+      </w:r>
+      <w:r>
+        <w:t xml:space="preserve">Kiến trúc quy trình nghiệp vụ </w:t>
+      </w:r>
+      <w:r>
+        <w:t>tại phường Tân Hải.</w:t>
+      </w:r>
       <w:bookmarkEnd w:id="14"/>
-    </w:p>
-    <w:p>
-      <w:pPr>
-        <w:pStyle w:val="Heading3"/>
-      </w:pPr>
-      <w:bookmarkStart w:id="15" w:name="_Toc236264120"/>
-      <w:bookmarkStart w:id="16" w:name="_Toc236513294"/>
-      <w:r>
-        <w:t xml:space="preserve">2.1. </w:t>
-      </w:r>
-      <w:r>
-        <w:t xml:space="preserve">Kiến trúc quy trình nghiệp vụ </w:t>
-      </w:r>
-      <w:r>
-        <w:t>tại phường Tân Hải.</w:t>
-      </w:r>
       <w:bookmarkEnd w:id="15"/>
+    </w:p>
+    <w:p>
+      <w:pPr>
+        <w:pStyle w:val="Heading4"/>
+      </w:pPr>
+      <w:bookmarkStart w:id="16" w:name="_Toc236264121"/>
+      <w:bookmarkStart w:id="17" w:name="_Toc236513295"/>
+      <w:r>
+        <w:t>2.1.1 Phân loại quy trình.</w:t>
+      </w:r>
       <w:bookmarkEnd w:id="16"/>
-    </w:p>
-    <w:p>
-      <w:pPr>
-        <w:pStyle w:val="Heading4"/>
-      </w:pPr>
-      <w:bookmarkStart w:id="17" w:name="_Toc236264121"/>
-      <w:bookmarkStart w:id="18" w:name="_Toc236513295"/>
-      <w:r>
-        <w:t>2.1.1 Phân loại quy trình.</w:t>
-      </w:r>
       <w:bookmarkEnd w:id="17"/>
-      <w:bookmarkEnd w:id="18"/>
     </w:p>
     <w:p>
       <w:pPr>
@@ -6011,44 +6015,44 @@
       <w:pPr>
         <w:pStyle w:val="Heading4"/>
       </w:pPr>
-      <w:bookmarkStart w:id="19" w:name="_Toc236264122"/>
-      <w:bookmarkStart w:id="20" w:name="_Toc236513296"/>
+      <w:bookmarkStart w:id="18" w:name="_Toc236264122"/>
+      <w:bookmarkStart w:id="19" w:name="_Toc236513296"/>
       <w:r>
         <w:lastRenderedPageBreak/>
         <w:t>2.1.2 Quy trình quản lý (Processs Management).</w:t>
       </w:r>
+      <w:bookmarkEnd w:id="18"/>
       <w:bookmarkEnd w:id="19"/>
+    </w:p>
+    <w:p>
+      <w:pPr>
+        <w:pStyle w:val="Heading4"/>
+      </w:pPr>
+      <w:bookmarkStart w:id="20" w:name="_Toc236264123"/>
+      <w:bookmarkStart w:id="21" w:name="_Toc236513297"/>
+      <w:r>
+        <w:t>2.1.3 Quy trình cốt lõi (Processs Core).</w:t>
+      </w:r>
       <w:bookmarkEnd w:id="20"/>
-    </w:p>
-    <w:p>
-      <w:pPr>
-        <w:pStyle w:val="Heading4"/>
-      </w:pPr>
-      <w:bookmarkStart w:id="21" w:name="_Toc236264123"/>
-      <w:bookmarkStart w:id="22" w:name="_Toc236513297"/>
-      <w:r>
-        <w:t>2.1.3 Quy trình cốt lõi (Processs Core).</w:t>
-      </w:r>
       <w:bookmarkEnd w:id="21"/>
+    </w:p>
+    <w:p>
+      <w:pPr>
+        <w:pStyle w:val="Heading5"/>
+      </w:pPr>
+      <w:bookmarkStart w:id="22" w:name="_Toc236264124"/>
+      <w:bookmarkStart w:id="23" w:name="_Toc236513298"/>
+      <w:r>
+        <w:t>2.1.3.1 Quy trình tiếp nhận hồ sơ</w:t>
+      </w:r>
       <w:bookmarkEnd w:id="22"/>
-    </w:p>
-    <w:p>
-      <w:pPr>
-        <w:pStyle w:val="Heading5"/>
-      </w:pPr>
-      <w:bookmarkStart w:id="23" w:name="_Toc236264124"/>
-      <w:bookmarkStart w:id="24" w:name="_Toc236513298"/>
-      <w:r>
-        <w:t>2.1.3.1 Quy trình tiếp nhận hồ sơ</w:t>
-      </w:r>
       <w:bookmarkEnd w:id="23"/>
-      <w:bookmarkEnd w:id="24"/>
     </w:p>
     <w:p>
       <w:pPr>
         <w:keepNext/>
       </w:pPr>
-      <w:bookmarkStart w:id="25" w:name="_Toc236264125"/>
+      <w:bookmarkStart w:id="24" w:name="_Toc236264125"/>
       <w:r>
         <w:rPr>
           <w:noProof/>
@@ -6107,35 +6111,22 @@
       <w:pPr>
         <w:pStyle w:val="Caption"/>
       </w:pPr>
-      <w:bookmarkStart w:id="26" w:name="_Toc236242614"/>
+      <w:bookmarkStart w:id="25" w:name="_Toc236242614"/>
       <w:r>
         <w:t xml:space="preserve">Hình </w:t>
       </w:r>
-      <w:r>
-        <w:fldChar w:fldCharType="begin"/>
-      </w:r>
-      <w:r>
-        <w:instrText xml:space="preserve"> SEQ Hình \* ARABIC </w:instrText>
-      </w:r>
-      <w:r>
-        <w:fldChar w:fldCharType="separate"/>
-      </w:r>
-      <w:r>
-        <w:rPr>
-          <w:noProof/>
-        </w:rPr>
-        <w:t>1</w:t>
-      </w:r>
-      <w:r>
-        <w:rPr>
-          <w:noProof/>
-        </w:rPr>
-        <w:fldChar w:fldCharType="end"/>
-      </w:r>
+      <w:fldSimple w:instr=" SEQ Hình \* ARABIC ">
+        <w:r>
+          <w:rPr>
+            <w:noProof/>
+          </w:rPr>
+          <w:t>1</w:t>
+        </w:r>
+      </w:fldSimple>
       <w:r>
         <w:t>. Quy trình tiếp nhận hồ sơ</w:t>
       </w:r>
-      <w:bookmarkEnd w:id="26"/>
+      <w:bookmarkEnd w:id="25"/>
     </w:p>
     <w:p>
       <w:pPr>
@@ -6374,7 +6365,7 @@
       <w:r>
         <w:t xml:space="preserve">2.1.3.2 </w:t>
       </w:r>
-      <w:bookmarkEnd w:id="25"/>
+      <w:bookmarkEnd w:id="24"/>
       <w:r>
         <w:t>Quy trình kiểm tra, thẩm định và xử lý hồ sơ</w:t>
       </w:r>
@@ -6384,7 +6375,7 @@
         </w:rPr>
         <w:t xml:space="preserve"> </w:t>
       </w:r>
-      <w:bookmarkStart w:id="27" w:name="_Toc236264126"/>
+      <w:bookmarkStart w:id="26" w:name="_Toc236264126"/>
       <w:r>
         <w:rPr>
           <w:noProof/>
@@ -6443,35 +6434,22 @@
       <w:pPr>
         <w:pStyle w:val="Caption"/>
       </w:pPr>
-      <w:bookmarkStart w:id="28" w:name="_Toc236242615"/>
+      <w:bookmarkStart w:id="27" w:name="_Toc236242615"/>
       <w:r>
         <w:t xml:space="preserve">Hình </w:t>
       </w:r>
-      <w:r>
-        <w:fldChar w:fldCharType="begin"/>
-      </w:r>
-      <w:r>
-        <w:instrText xml:space="preserve"> SEQ Hình \* ARABIC </w:instrText>
-      </w:r>
-      <w:r>
-        <w:fldChar w:fldCharType="separate"/>
-      </w:r>
-      <w:r>
-        <w:rPr>
-          <w:noProof/>
-        </w:rPr>
-        <w:t>2</w:t>
-      </w:r>
-      <w:r>
-        <w:rPr>
-          <w:noProof/>
-        </w:rPr>
-        <w:fldChar w:fldCharType="end"/>
-      </w:r>
+      <w:fldSimple w:instr=" SEQ Hình \* ARABIC ">
+        <w:r>
+          <w:rPr>
+            <w:noProof/>
+          </w:rPr>
+          <w:t>2</w:t>
+        </w:r>
+      </w:fldSimple>
       <w:r>
         <w:t>. Quy trình kiểm tra, thẩm định và xử lý hồ sơ</w:t>
       </w:r>
-      <w:bookmarkEnd w:id="28"/>
+      <w:bookmarkEnd w:id="27"/>
     </w:p>
     <w:p>
       <w:pPr>
@@ -6678,15 +6656,15 @@
       <w:pPr>
         <w:pStyle w:val="Heading5"/>
       </w:pPr>
-      <w:bookmarkStart w:id="29" w:name="_Toc236513299"/>
+      <w:bookmarkStart w:id="28" w:name="_Toc236513299"/>
       <w:r>
         <w:t xml:space="preserve">2.1.3.3 </w:t>
       </w:r>
-      <w:bookmarkEnd w:id="27"/>
+      <w:bookmarkEnd w:id="26"/>
       <w:r>
         <w:t>Quy trình phê duyệt và ban hành kết quả</w:t>
       </w:r>
-      <w:bookmarkEnd w:id="29"/>
+      <w:bookmarkEnd w:id="28"/>
     </w:p>
     <w:p>
       <w:pPr>
@@ -6750,35 +6728,22 @@
       <w:pPr>
         <w:pStyle w:val="Caption"/>
       </w:pPr>
-      <w:bookmarkStart w:id="30" w:name="_Toc236263982"/>
+      <w:bookmarkStart w:id="29" w:name="_Toc236263982"/>
       <w:r>
         <w:t xml:space="preserve">Hình </w:t>
       </w:r>
-      <w:r>
-        <w:fldChar w:fldCharType="begin"/>
-      </w:r>
-      <w:r>
-        <w:instrText xml:space="preserve"> SEQ Hình \* ARABIC </w:instrText>
-      </w:r>
-      <w:r>
-        <w:fldChar w:fldCharType="separate"/>
-      </w:r>
-      <w:r>
-        <w:rPr>
-          <w:noProof/>
-        </w:rPr>
-        <w:t>3</w:t>
-      </w:r>
-      <w:r>
-        <w:rPr>
-          <w:noProof/>
-        </w:rPr>
-        <w:fldChar w:fldCharType="end"/>
-      </w:r>
+      <w:fldSimple w:instr=" SEQ Hình \* ARABIC ">
+        <w:r>
+          <w:rPr>
+            <w:noProof/>
+          </w:rPr>
+          <w:t>3</w:t>
+        </w:r>
+      </w:fldSimple>
       <w:r>
         <w:t>. Quy trình phê duyệt và ban hành kết quả</w:t>
       </w:r>
-      <w:bookmarkEnd w:id="30"/>
+      <w:bookmarkEnd w:id="29"/>
     </w:p>
     <w:p>
       <w:pPr>
@@ -6922,13 +6887,13 @@
       <w:pPr>
         <w:pStyle w:val="Heading5"/>
       </w:pPr>
-      <w:bookmarkStart w:id="31" w:name="_Toc236264127"/>
-      <w:bookmarkStart w:id="32" w:name="_Toc236513300"/>
+      <w:bookmarkStart w:id="30" w:name="_Toc236264127"/>
+      <w:bookmarkStart w:id="31" w:name="_Toc236513300"/>
       <w:r>
         <w:t>2.1.3.4 Quy trình trả kết quả và thông báo</w:t>
       </w:r>
+      <w:bookmarkEnd w:id="30"/>
       <w:bookmarkEnd w:id="31"/>
-      <w:bookmarkEnd w:id="32"/>
     </w:p>
     <w:p>
       <w:pPr>
@@ -6992,35 +6957,22 @@
       <w:pPr>
         <w:pStyle w:val="Caption"/>
       </w:pPr>
-      <w:bookmarkStart w:id="33" w:name="_Toc236263983"/>
+      <w:bookmarkStart w:id="32" w:name="_Toc236263983"/>
       <w:r>
         <w:t xml:space="preserve">Hình </w:t>
       </w:r>
-      <w:r>
-        <w:fldChar w:fldCharType="begin"/>
-      </w:r>
-      <w:r>
-        <w:instrText xml:space="preserve"> SEQ Hình \* ARABIC </w:instrText>
-      </w:r>
-      <w:r>
-        <w:fldChar w:fldCharType="separate"/>
-      </w:r>
-      <w:r>
-        <w:rPr>
-          <w:noProof/>
-        </w:rPr>
-        <w:t>4</w:t>
-      </w:r>
-      <w:r>
-        <w:rPr>
-          <w:noProof/>
-        </w:rPr>
-        <w:fldChar w:fldCharType="end"/>
-      </w:r>
+      <w:fldSimple w:instr=" SEQ Hình \* ARABIC ">
+        <w:r>
+          <w:rPr>
+            <w:noProof/>
+          </w:rPr>
+          <w:t>4</w:t>
+        </w:r>
+      </w:fldSimple>
       <w:r>
         <w:t>. Quy trình trả kết quả và thông báo</w:t>
       </w:r>
-      <w:bookmarkEnd w:id="33"/>
+      <w:bookmarkEnd w:id="32"/>
     </w:p>
     <w:p>
       <w:pPr>
@@ -7164,47 +7116,47 @@
       <w:pPr>
         <w:pStyle w:val="Heading4"/>
       </w:pPr>
-      <w:bookmarkStart w:id="34" w:name="_Toc236264128"/>
-      <w:bookmarkStart w:id="35" w:name="_Toc236513301"/>
+      <w:bookmarkStart w:id="33" w:name="_Toc236264128"/>
+      <w:bookmarkStart w:id="34" w:name="_Toc236513301"/>
       <w:r>
         <w:t>2.1.4 Quy trình hỗ trợ (Processs Support).</w:t>
       </w:r>
+      <w:bookmarkEnd w:id="33"/>
       <w:bookmarkEnd w:id="34"/>
+    </w:p>
+    <w:p>
+      <w:pPr>
+        <w:pStyle w:val="Heading3"/>
+      </w:pPr>
+      <w:bookmarkStart w:id="35" w:name="_Toc236264129"/>
+      <w:bookmarkStart w:id="36" w:name="_Toc236513302"/>
+      <w:r>
+        <w:t>2.2 Mô hình hóa quy trình quản lý (Processs Management).</w:t>
+      </w:r>
       <w:bookmarkEnd w:id="35"/>
+      <w:bookmarkEnd w:id="36"/>
     </w:p>
     <w:p>
       <w:pPr>
         <w:pStyle w:val="Heading3"/>
       </w:pPr>
-      <w:bookmarkStart w:id="36" w:name="_Toc236264129"/>
-      <w:bookmarkStart w:id="37" w:name="_Toc236513302"/>
-      <w:r>
-        <w:t>2.2 Mô hình hóa quy trình quản lý (Processs Management).</w:t>
-      </w:r>
-      <w:bookmarkEnd w:id="36"/>
+      <w:bookmarkStart w:id="37" w:name="_Toc236264130"/>
+      <w:bookmarkStart w:id="38" w:name="_Toc236513303"/>
+      <w:r>
+        <w:t>2.3 Mô hình hóa quy trình cốt lõi (Processs Core).</w:t>
+      </w:r>
       <w:bookmarkEnd w:id="37"/>
-    </w:p>
-    <w:p>
-      <w:pPr>
-        <w:pStyle w:val="Heading3"/>
-      </w:pPr>
-      <w:bookmarkStart w:id="38" w:name="_Toc236264130"/>
-      <w:bookmarkStart w:id="39" w:name="_Toc236513303"/>
-      <w:r>
-        <w:t>2.3 Mô hình hóa quy trình cốt lõi (Processs Core).</w:t>
-      </w:r>
       <w:bookmarkEnd w:id="38"/>
+    </w:p>
+    <w:p>
+      <w:pPr>
+        <w:pStyle w:val="Heading4"/>
+      </w:pPr>
+      <w:bookmarkStart w:id="39" w:name="_Toc236513304"/>
+      <w:r>
+        <w:t>2.3.1 Mô hình hóa quy trình tiếp nhận hồ sơ</w:t>
+      </w:r>
       <w:bookmarkEnd w:id="39"/>
-    </w:p>
-    <w:p>
-      <w:pPr>
-        <w:pStyle w:val="Heading4"/>
-      </w:pPr>
-      <w:bookmarkStart w:id="40" w:name="_Toc236513304"/>
-      <w:r>
-        <w:t>2.3.1 Mô hình hóa quy trình tiếp nhận hồ sơ</w:t>
-      </w:r>
-      <w:bookmarkEnd w:id="40"/>
     </w:p>
     <w:p>
       <w:r>
@@ -7255,27 +7207,14 @@
       <w:r>
         <w:t xml:space="preserve">Hình </w:t>
       </w:r>
-      <w:r>
-        <w:fldChar w:fldCharType="begin"/>
-      </w:r>
-      <w:r>
-        <w:instrText xml:space="preserve"> SEQ Hình \* ARABIC </w:instrText>
-      </w:r>
-      <w:r>
-        <w:fldChar w:fldCharType="separate"/>
-      </w:r>
-      <w:r>
-        <w:rPr>
-          <w:noProof/>
-        </w:rPr>
-        <w:t>5</w:t>
-      </w:r>
-      <w:r>
-        <w:rPr>
-          <w:noProof/>
-        </w:rPr>
-        <w:fldChar w:fldCharType="end"/>
-      </w:r>
+      <w:fldSimple w:instr=" SEQ Hình \* ARABIC ">
+        <w:r>
+          <w:rPr>
+            <w:noProof/>
+          </w:rPr>
+          <w:t>5</w:t>
+        </w:r>
+      </w:fldSimple>
       <w:r>
         <w:t>. Mô hình hóa q</w:t>
       </w:r>
@@ -7287,17 +7226,19 @@
       <w:pPr>
         <w:pStyle w:val="Heading5"/>
       </w:pPr>
-      <w:bookmarkStart w:id="41" w:name="_Toc236513305"/>
+      <w:bookmarkStart w:id="40" w:name="_Toc236513305"/>
       <w:r>
         <w:t>2.3.1.1 Mô tả quy trình hiện có</w:t>
       </w:r>
-      <w:bookmarkEnd w:id="41"/>
+      <w:bookmarkEnd w:id="40"/>
     </w:p>
     <w:p>
       <w:r>
         <w:tab/>
         <w:t>Bảng 2. Mô tả mô hình quy trình tiếp nhận hồ trực tiếp BNĐP</w:t>
       </w:r>
+      <w:bookmarkStart w:id="41" w:name="_GoBack"/>
+      <w:bookmarkEnd w:id="41"/>
     </w:p>
     <w:tbl>
       <w:tblPr>
@@ -9601,7 +9542,10 @@
         <w:t xml:space="preserve">Chương III. </w:t>
       </w:r>
       <w:r>
-        <w:t>TRIỂN KHAI HỆ THỐNG</w:t>
+        <w:t>PHÂN TÍCH</w:t>
+      </w:r>
+      <w:r>
+        <w:t xml:space="preserve"> HỆ THỐNG</w:t>
       </w:r>
       <w:r>
         <w:t>.</w:t>
@@ -9903,7 +9847,7 @@
             <w:noProof/>
             <w:szCs w:val="26"/>
           </w:rPr>
-          <w:t>20</w:t>
+          <w:t>15</w:t>
         </w:r>
         <w:r>
           <w:rPr>
@@ -14027,7 +13971,7 @@
 </file>
 
 <file path=customXml/itemProps1.xml><?xml version="1.0" encoding="utf-8"?>
-<ds:datastoreItem xmlns:ds="http://schemas.openxmlformats.org/officeDocument/2006/customXml" ds:itemID="{228CD21D-209B-4CCB-A9DC-78145B7266CE}">
+<ds:datastoreItem xmlns:ds="http://schemas.openxmlformats.org/officeDocument/2006/customXml" ds:itemID="{C8ED53E6-99A7-4123-9A15-F1A88BFC5B2F}">
   <ds:schemaRefs>
     <ds:schemaRef ds:uri="http://schemas.openxmlformats.org/officeDocument/2006/bibliography"/>
   </ds:schemaRefs>

</xml_diff>

<commit_message>
update phân tích định tính - sự lãng phí
</commit_message>
<xml_diff>
--- a/DoAn_Final.docx
+++ b/DoAn_Final.docx
@@ -79,7 +79,7 @@
           <w:szCs w:val="26"/>
         </w:rPr>
         <w:drawing>
-          <wp:inline distT="0" distB="0" distL="0" distR="0" wp14:anchorId="61AA30EF" wp14:editId="3E3F6575">
+          <wp:inline distT="0" distB="0" distL="0" distR="0" wp14:anchorId="61AA30EF" wp14:editId="0117F4E6">
             <wp:extent cx="1948539" cy="1606164"/>
             <wp:effectExtent l="0" t="0" r="0" b="0"/>
             <wp:docPr id="990850389" name="Picture 1"/>
@@ -15814,10 +15814,7 @@
         <w:pStyle w:val="Heading2"/>
       </w:pPr>
       <w:r>
-        <w:t>3.1</w:t>
-      </w:r>
-      <w:r>
-        <w:t xml:space="preserve"> Phân tích quy trình tiếp nhận hồ sơ</w:t>
+        <w:t>3.1 Phân tích quy trình tiếp nhận hồ sơ</w:t>
       </w:r>
     </w:p>
     <w:p>
@@ -15847,7 +15844,7 @@
           <w:szCs w:val="26"/>
         </w:rPr>
         <w:drawing>
-          <wp:inline distT="0" distB="0" distL="0" distR="0" wp14:anchorId="26C62968" wp14:editId="2F674807">
+          <wp:inline distT="0" distB="0" distL="0" distR="0" wp14:anchorId="26C62968" wp14:editId="5ADD9131">
             <wp:extent cx="5725795" cy="2461260"/>
             <wp:effectExtent l="0" t="0" r="8255" b="0"/>
             <wp:docPr id="1702479062" name="Picture 21"/>
@@ -15903,24 +15900,14 @@
       <w:r>
         <w:t xml:space="preserve">Hình </w:t>
       </w:r>
-      <w:r>
-        <w:fldChar w:fldCharType="begin"/>
-      </w:r>
-      <w:r>
-        <w:instrText xml:space="preserve"> SEQ Hình \* ARABIC </w:instrText>
-      </w:r>
-      <w:r>
-        <w:fldChar w:fldCharType="separate"/>
-      </w:r>
-      <w:r>
-        <w:rPr>
-          <w:noProof/>
-        </w:rPr>
-        <w:t>6</w:t>
-      </w:r>
-      <w:r>
-        <w:fldChar w:fldCharType="end"/>
-      </w:r>
+      <w:fldSimple w:instr=" SEQ Hình \* ARABIC ">
+        <w:r>
+          <w:rPr>
+            <w:noProof/>
+          </w:rPr>
+          <w:t>6</w:t>
+        </w:r>
+      </w:fldSimple>
       <w:r>
         <w:t>. Phân tích giá trị gia tăng trên quy trình tiếp nhận</w:t>
       </w:r>
@@ -15967,6 +15954,16 @@
           <w14:ligatures w14:val="none"/>
         </w:rPr>
         <w:t xml:space="preserve"> phân tích định tính </w:t>
+      </w:r>
+      <w:r>
+        <w:rPr>
+          <w:rFonts w:eastAsia="Times New Roman" w:cs="Times New Roman"/>
+          <w:color w:val="000000"/>
+          <w:kern w:val="0"/>
+          <w:szCs w:val="26"/>
+          <w14:ligatures w14:val="none"/>
+        </w:rPr>
+        <w:t>giá trị gia tăng</w:t>
       </w:r>
     </w:p>
     <w:tbl>
@@ -17700,6 +17697,2542 @@
       </w:r>
     </w:p>
     <w:p>
+      <w:r>
+        <w:rPr>
+          <w:noProof/>
+          <w:color w:val="000000"/>
+          <w:szCs w:val="26"/>
+        </w:rPr>
+        <w:drawing>
+          <wp:inline distT="0" distB="0" distL="0" distR="0" wp14:anchorId="55253AF6" wp14:editId="59A64623">
+            <wp:extent cx="5731510" cy="2321560"/>
+            <wp:effectExtent l="0" t="0" r="2540" b="2540"/>
+            <wp:docPr id="1621202187" name="Picture 20"/>
+            <wp:cNvGraphicFramePr>
+              <a:graphicFrameLocks xmlns:a="http://schemas.openxmlformats.org/drawingml/2006/main" noChangeAspect="1"/>
+            </wp:cNvGraphicFramePr>
+            <a:graphic xmlns:a="http://schemas.openxmlformats.org/drawingml/2006/main">
+              <a:graphicData uri="http://schemas.openxmlformats.org/drawingml/2006/picture">
+                <pic:pic xmlns:pic="http://schemas.openxmlformats.org/drawingml/2006/picture">
+                  <pic:nvPicPr>
+                    <pic:cNvPr id="0" name="Picture 1"/>
+                    <pic:cNvPicPr>
+                      <a:picLocks noChangeAspect="1" noChangeArrowheads="1"/>
+                    </pic:cNvPicPr>
+                  </pic:nvPicPr>
+                  <pic:blipFill>
+                    <a:blip r:embed="rId19" cstate="print">
+                      <a:extLst>
+                        <a:ext uri="{28A0092B-C50C-407E-A947-70E740481C1C}">
+                          <a14:useLocalDpi xmlns:a14="http://schemas.microsoft.com/office/drawing/2010/main" val="0"/>
+                        </a:ext>
+                      </a:extLst>
+                    </a:blip>
+                    <a:srcRect/>
+                    <a:stretch>
+                      <a:fillRect/>
+                    </a:stretch>
+                  </pic:blipFill>
+                  <pic:spPr bwMode="auto">
+                    <a:xfrm>
+                      <a:off x="0" y="0"/>
+                      <a:ext cx="5731510" cy="2321560"/>
+                    </a:xfrm>
+                    <a:prstGeom prst="rect">
+                      <a:avLst/>
+                    </a:prstGeom>
+                    <a:noFill/>
+                    <a:ln>
+                      <a:noFill/>
+                    </a:ln>
+                  </pic:spPr>
+                </pic:pic>
+              </a:graphicData>
+            </a:graphic>
+          </wp:inline>
+        </w:drawing>
+      </w:r>
+    </w:p>
+    <w:p>
+      <w:pPr>
+        <w:pStyle w:val="Caption"/>
+      </w:pPr>
+      <w:r>
+        <w:t xml:space="preserve">Hình </w:t>
+      </w:r>
+      <w:r>
+        <w:fldChar w:fldCharType="begin"/>
+      </w:r>
+      <w:r>
+        <w:instrText xml:space="preserve"> SEQ Hình \* ARABIC </w:instrText>
+      </w:r>
+      <w:r>
+        <w:fldChar w:fldCharType="separate"/>
+      </w:r>
+      <w:r>
+        <w:rPr>
+          <w:noProof/>
+        </w:rPr>
+        <w:t>7</w:t>
+      </w:r>
+      <w:r>
+        <w:fldChar w:fldCharType="end"/>
+      </w:r>
+      <w:r>
+        <w:t xml:space="preserve">. Phân tích </w:t>
+      </w:r>
+      <w:r>
+        <w:t>sự lãng phí</w:t>
+      </w:r>
+      <w:r>
+        <w:t xml:space="preserve"> trên quy trình tiếp nhận</w:t>
+      </w:r>
+    </w:p>
+    <w:p>
+      <w:r>
+        <w:tab/>
+        <w:t>Bảng 4: Phân tích sự lãng phí</w:t>
+      </w:r>
+    </w:p>
+    <w:tbl>
+      <w:tblPr>
+        <w:tblStyle w:val="TableGrid"/>
+        <w:tblW w:w="0" w:type="auto"/>
+        <w:tblLook w:val="04A0" w:firstRow="1" w:lastRow="0" w:firstColumn="1" w:lastColumn="0" w:noHBand="0" w:noVBand="1"/>
+      </w:tblPr>
+      <w:tblGrid>
+        <w:gridCol w:w="846"/>
+        <w:gridCol w:w="1984"/>
+        <w:gridCol w:w="1677"/>
+        <w:gridCol w:w="1503"/>
+        <w:gridCol w:w="1503"/>
+        <w:gridCol w:w="1503"/>
+      </w:tblGrid>
+      <w:tr>
+        <w:tc>
+          <w:tcPr>
+            <w:tcW w:w="846" w:type="dxa"/>
+          </w:tcPr>
+          <w:p>
+            <w:pPr>
+              <w:jc w:val="center"/>
+            </w:pPr>
+            <w:r>
+              <w:rPr>
+                <w:color w:val="000000"/>
+                <w:szCs w:val="26"/>
+              </w:rPr>
+              <w:t>STT</w:t>
+            </w:r>
+          </w:p>
+        </w:tc>
+        <w:tc>
+          <w:tcPr>
+            <w:tcW w:w="1984" w:type="dxa"/>
+          </w:tcPr>
+          <w:p>
+            <w:pPr>
+              <w:jc w:val="center"/>
+            </w:pPr>
+            <w:r>
+              <w:rPr>
+                <w:color w:val="000000"/>
+                <w:szCs w:val="26"/>
+              </w:rPr>
+              <w:t>Task</w:t>
+            </w:r>
+          </w:p>
+        </w:tc>
+        <w:tc>
+          <w:tcPr>
+            <w:tcW w:w="1677" w:type="dxa"/>
+          </w:tcPr>
+          <w:p>
+            <w:pPr>
+              <w:jc w:val="center"/>
+            </w:pPr>
+            <w:r>
+              <w:rPr>
+                <w:color w:val="000000"/>
+                <w:szCs w:val="26"/>
+              </w:rPr>
+              <w:t>Loại lãng phí</w:t>
+            </w:r>
+          </w:p>
+        </w:tc>
+        <w:tc>
+          <w:tcPr>
+            <w:tcW w:w="1503" w:type="dxa"/>
+          </w:tcPr>
+          <w:p>
+            <w:pPr>
+              <w:jc w:val="center"/>
+            </w:pPr>
+            <w:r>
+              <w:rPr>
+                <w:color w:val="000000"/>
+                <w:szCs w:val="26"/>
+              </w:rPr>
+              <w:t>Liệt kê</w:t>
+            </w:r>
+          </w:p>
+        </w:tc>
+        <w:tc>
+          <w:tcPr>
+            <w:tcW w:w="1503" w:type="dxa"/>
+          </w:tcPr>
+          <w:p>
+            <w:pPr>
+              <w:jc w:val="center"/>
+            </w:pPr>
+            <w:r>
+              <w:rPr>
+                <w:color w:val="000000"/>
+                <w:szCs w:val="26"/>
+              </w:rPr>
+              <w:t>Mô tả</w:t>
+            </w:r>
+          </w:p>
+        </w:tc>
+        <w:tc>
+          <w:tcPr>
+            <w:tcW w:w="1503" w:type="dxa"/>
+          </w:tcPr>
+          <w:p>
+            <w:pPr>
+              <w:jc w:val="center"/>
+            </w:pPr>
+            <w:r>
+              <w:rPr>
+                <w:color w:val="000000"/>
+                <w:szCs w:val="26"/>
+              </w:rPr>
+              <w:t>Khắc phục</w:t>
+            </w:r>
+          </w:p>
+        </w:tc>
+      </w:tr>
+      <w:tr>
+        <w:tc>
+          <w:tcPr>
+            <w:tcW w:w="846" w:type="dxa"/>
+          </w:tcPr>
+          <w:p>
+            <w:pPr>
+              <w:jc w:val="center"/>
+            </w:pPr>
+            <w:r>
+              <w:rPr>
+                <w:color w:val="000000"/>
+                <w:szCs w:val="26"/>
+              </w:rPr>
+              <w:t>1</w:t>
+            </w:r>
+          </w:p>
+        </w:tc>
+        <w:tc>
+          <w:tcPr>
+            <w:tcW w:w="1984" w:type="dxa"/>
+          </w:tcPr>
+          <w:p>
+            <w:pPr>
+              <w:jc w:val="center"/>
+            </w:pPr>
+            <w:r>
+              <w:rPr>
+                <w:color w:val="000000"/>
+                <w:szCs w:val="26"/>
+              </w:rPr>
+              <w:t>Tra cứu thủ tục</w:t>
+            </w:r>
+          </w:p>
+        </w:tc>
+        <w:tc>
+          <w:tcPr>
+            <w:tcW w:w="1677" w:type="dxa"/>
+          </w:tcPr>
+          <w:p>
+            <w:pPr>
+              <w:jc w:val="center"/>
+            </w:pPr>
+            <w:r>
+              <w:rPr>
+                <w:color w:val="000000"/>
+                <w:szCs w:val="26"/>
+              </w:rPr>
+              <w:t>Hold</w:t>
+            </w:r>
+          </w:p>
+        </w:tc>
+        <w:tc>
+          <w:tcPr>
+            <w:tcW w:w="1503" w:type="dxa"/>
+          </w:tcPr>
+          <w:p>
+            <w:pPr>
+              <w:jc w:val="center"/>
+            </w:pPr>
+            <w:r>
+              <w:rPr>
+                <w:color w:val="000000"/>
+                <w:szCs w:val="26"/>
+              </w:rPr>
+              <w:t>Chờ/tốn thời gian tra cứu</w:t>
+            </w:r>
+          </w:p>
+        </w:tc>
+        <w:tc>
+          <w:tcPr>
+            <w:tcW w:w="1503" w:type="dxa"/>
+          </w:tcPr>
+          <w:p>
+            <w:pPr>
+              <w:jc w:val="center"/>
+            </w:pPr>
+            <w:r>
+              <w:rPr>
+                <w:color w:val="000000"/>
+                <w:szCs w:val="26"/>
+              </w:rPr>
+              <w:t>Người dân có thể mất thời gian tìm đúng thủ tục, biểu mẫu và thành phần hồ sơ nếu thông tin khó tìm hoặc trình bày chưa rõ.</w:t>
+            </w:r>
+          </w:p>
+        </w:tc>
+        <w:tc>
+          <w:tcPr>
+            <w:tcW w:w="1503" w:type="dxa"/>
+          </w:tcPr>
+          <w:p>
+            <w:pPr>
+              <w:jc w:val="center"/>
+            </w:pPr>
+            <w:r>
+              <w:rPr>
+                <w:color w:val="000000"/>
+                <w:szCs w:val="26"/>
+              </w:rPr>
+              <w:t>Chuẩn hóa thông tin trên Cổng DVC, bổ sung công cụ tìm kiếm và checklist hồ sơ.</w:t>
+            </w:r>
+          </w:p>
+        </w:tc>
+      </w:tr>
+      <w:tr>
+        <w:tc>
+          <w:tcPr>
+            <w:tcW w:w="846" w:type="dxa"/>
+          </w:tcPr>
+          <w:p>
+            <w:pPr>
+              <w:jc w:val="center"/>
+            </w:pPr>
+            <w:r>
+              <w:rPr>
+                <w:color w:val="000000"/>
+                <w:szCs w:val="26"/>
+              </w:rPr>
+              <w:t>2</w:t>
+            </w:r>
+          </w:p>
+        </w:tc>
+        <w:tc>
+          <w:tcPr>
+            <w:tcW w:w="1984" w:type="dxa"/>
+          </w:tcPr>
+          <w:p>
+            <w:pPr>
+              <w:jc w:val="center"/>
+            </w:pPr>
+            <w:r>
+              <w:rPr>
+                <w:color w:val="000000"/>
+                <w:szCs w:val="26"/>
+              </w:rPr>
+              <w:t>Chuẩn bị hồ sơ</w:t>
+            </w:r>
+          </w:p>
+        </w:tc>
+        <w:tc>
+          <w:tcPr>
+            <w:tcW w:w="1677" w:type="dxa"/>
+          </w:tcPr>
+          <w:p>
+            <w:pPr>
+              <w:jc w:val="center"/>
+            </w:pPr>
+            <w:r>
+              <w:rPr>
+                <w:color w:val="000000"/>
+                <w:szCs w:val="26"/>
+              </w:rPr>
+              <w:t>Overdo</w:t>
+            </w:r>
+          </w:p>
+        </w:tc>
+        <w:tc>
+          <w:tcPr>
+            <w:tcW w:w="1503" w:type="dxa"/>
+          </w:tcPr>
+          <w:p>
+            <w:pPr>
+              <w:jc w:val="center"/>
+            </w:pPr>
+            <w:r>
+              <w:rPr>
+                <w:color w:val="000000"/>
+                <w:szCs w:val="26"/>
+              </w:rPr>
+              <w:t>Chuẩn bị lại giấy tờ</w:t>
+            </w:r>
+          </w:p>
+        </w:tc>
+        <w:tc>
+          <w:tcPr>
+            <w:tcW w:w="1503" w:type="dxa"/>
+          </w:tcPr>
+          <w:p>
+            <w:pPr>
+              <w:jc w:val="center"/>
+            </w:pPr>
+            <w:r>
+              <w:rPr>
+                <w:color w:val="000000"/>
+                <w:szCs w:val="26"/>
+              </w:rPr>
+              <w:t xml:space="preserve">Người dân có thể phải chuẩn bị lại giấy tờ mà </w:t>
+            </w:r>
+            <w:r>
+              <w:rPr>
+                <w:color w:val="000000"/>
+                <w:szCs w:val="26"/>
+              </w:rPr>
+              <w:lastRenderedPageBreak/>
+              <w:t>cơ quan đã có dữ liệu hoặc có thể khai thác từ CSDL.</w:t>
+            </w:r>
+          </w:p>
+        </w:tc>
+        <w:tc>
+          <w:tcPr>
+            <w:tcW w:w="1503" w:type="dxa"/>
+          </w:tcPr>
+          <w:p>
+            <w:pPr>
+              <w:jc w:val="center"/>
+            </w:pPr>
+            <w:r>
+              <w:rPr>
+                <w:color w:val="000000"/>
+                <w:szCs w:val="26"/>
+              </w:rPr>
+              <w:lastRenderedPageBreak/>
+              <w:t xml:space="preserve">Tái sử dụng dữ liệu đã có, hạn chế </w:t>
+            </w:r>
+            <w:r>
+              <w:rPr>
+                <w:color w:val="000000"/>
+                <w:szCs w:val="26"/>
+              </w:rPr>
+              <w:lastRenderedPageBreak/>
+              <w:t>yêu cầu nộp lại giấy tờ.</w:t>
+            </w:r>
+          </w:p>
+        </w:tc>
+      </w:tr>
+      <w:tr>
+        <w:tc>
+          <w:tcPr>
+            <w:tcW w:w="846" w:type="dxa"/>
+          </w:tcPr>
+          <w:p>
+            <w:pPr>
+              <w:jc w:val="center"/>
+            </w:pPr>
+            <w:r>
+              <w:rPr>
+                <w:color w:val="000000"/>
+                <w:szCs w:val="26"/>
+              </w:rPr>
+              <w:lastRenderedPageBreak/>
+              <w:t>3</w:t>
+            </w:r>
+          </w:p>
+        </w:tc>
+        <w:tc>
+          <w:tcPr>
+            <w:tcW w:w="1984" w:type="dxa"/>
+          </w:tcPr>
+          <w:p>
+            <w:pPr>
+              <w:jc w:val="center"/>
+            </w:pPr>
+            <w:r>
+              <w:rPr>
+                <w:color w:val="000000"/>
+                <w:szCs w:val="26"/>
+              </w:rPr>
+              <w:t>Nộp hồ sơ</w:t>
+            </w:r>
+          </w:p>
+        </w:tc>
+        <w:tc>
+          <w:tcPr>
+            <w:tcW w:w="1677" w:type="dxa"/>
+          </w:tcPr>
+          <w:p>
+            <w:pPr>
+              <w:jc w:val="center"/>
+            </w:pPr>
+            <w:r>
+              <w:rPr>
+                <w:color w:val="000000"/>
+                <w:szCs w:val="26"/>
+              </w:rPr>
+              <w:t>Move</w:t>
+            </w:r>
+          </w:p>
+        </w:tc>
+        <w:tc>
+          <w:tcPr>
+            <w:tcW w:w="1503" w:type="dxa"/>
+          </w:tcPr>
+          <w:p>
+            <w:pPr>
+              <w:jc w:val="center"/>
+            </w:pPr>
+            <w:r>
+              <w:rPr>
+                <w:color w:val="000000"/>
+                <w:szCs w:val="26"/>
+              </w:rPr>
+              <w:t>Di chuyển hồ sơ</w:t>
+            </w:r>
+          </w:p>
+        </w:tc>
+        <w:tc>
+          <w:tcPr>
+            <w:tcW w:w="1503" w:type="dxa"/>
+          </w:tcPr>
+          <w:p>
+            <w:pPr>
+              <w:jc w:val="center"/>
+            </w:pPr>
+            <w:r>
+              <w:rPr>
+                <w:color w:val="000000"/>
+                <w:szCs w:val="26"/>
+              </w:rPr>
+              <w:t>Nếu nộp trực tiếp, người dân phải di chuyển đến Bộ phận Một cửa và mang theo hồ sơ giấy.</w:t>
+            </w:r>
+          </w:p>
+        </w:tc>
+        <w:tc>
+          <w:tcPr>
+            <w:tcW w:w="1503" w:type="dxa"/>
+          </w:tcPr>
+          <w:p>
+            <w:pPr>
+              <w:jc w:val="center"/>
+            </w:pPr>
+            <w:r>
+              <w:rPr>
+                <w:color w:val="000000"/>
+                <w:szCs w:val="26"/>
+              </w:rPr>
+              <w:t>Khuyến khích nộp trực tuyến, sử dụng hồ sơ điện tử.</w:t>
+            </w:r>
+          </w:p>
+        </w:tc>
+      </w:tr>
+      <w:tr>
+        <w:tc>
+          <w:tcPr>
+            <w:tcW w:w="846" w:type="dxa"/>
+          </w:tcPr>
+          <w:p>
+            <w:pPr>
+              <w:jc w:val="center"/>
+            </w:pPr>
+            <w:r>
+              <w:rPr>
+                <w:color w:val="000000"/>
+                <w:szCs w:val="26"/>
+              </w:rPr>
+              <w:t>4</w:t>
+            </w:r>
+          </w:p>
+        </w:tc>
+        <w:tc>
+          <w:tcPr>
+            <w:tcW w:w="1984" w:type="dxa"/>
+          </w:tcPr>
+          <w:p>
+            <w:pPr>
+              <w:jc w:val="center"/>
+            </w:pPr>
+            <w:r>
+              <w:rPr>
+                <w:color w:val="000000"/>
+                <w:szCs w:val="26"/>
+              </w:rPr>
+              <w:t>Tiếp nhận hồ sơ</w:t>
+            </w:r>
+          </w:p>
+        </w:tc>
+        <w:tc>
+          <w:tcPr>
+            <w:tcW w:w="1677" w:type="dxa"/>
+          </w:tcPr>
+          <w:p>
+            <w:pPr>
+              <w:jc w:val="center"/>
+            </w:pPr>
+            <w:r>
+              <w:rPr>
+                <w:color w:val="000000"/>
+                <w:szCs w:val="26"/>
+              </w:rPr>
+              <w:t>Hold</w:t>
+            </w:r>
+          </w:p>
+        </w:tc>
+        <w:tc>
+          <w:tcPr>
+            <w:tcW w:w="1503" w:type="dxa"/>
+          </w:tcPr>
+          <w:p>
+            <w:pPr>
+              <w:jc w:val="center"/>
+            </w:pPr>
+            <w:r>
+              <w:rPr>
+                <w:color w:val="000000"/>
+                <w:szCs w:val="26"/>
+              </w:rPr>
+              <w:t>Chờ tiếp nhận</w:t>
+            </w:r>
+          </w:p>
+        </w:tc>
+        <w:tc>
+          <w:tcPr>
+            <w:tcW w:w="1503" w:type="dxa"/>
+          </w:tcPr>
+          <w:p>
+            <w:pPr>
+              <w:jc w:val="center"/>
+            </w:pPr>
+            <w:r>
+              <w:rPr>
+                <w:color w:val="000000"/>
+                <w:szCs w:val="26"/>
+              </w:rPr>
+              <w:t>Có thể phát sinh thời gian chờ khi đông người hoặc nhiều hồ sơ được tiếp nhận cùng lúc.</w:t>
+            </w:r>
+          </w:p>
+        </w:tc>
+        <w:tc>
+          <w:tcPr>
+            <w:tcW w:w="1503" w:type="dxa"/>
+          </w:tcPr>
+          <w:p>
+            <w:pPr>
+              <w:jc w:val="center"/>
+            </w:pPr>
+            <w:r>
+              <w:rPr>
+                <w:color w:val="000000"/>
+                <w:szCs w:val="26"/>
+              </w:rPr>
+              <w:t>Đặt lịch, lấy số tự động, phân luồng và tăng tiếp nhận trực tuyến.</w:t>
+            </w:r>
+          </w:p>
+        </w:tc>
+      </w:tr>
+      <w:tr>
+        <w:tc>
+          <w:tcPr>
+            <w:tcW w:w="846" w:type="dxa"/>
+          </w:tcPr>
+          <w:p>
+            <w:pPr>
+              <w:jc w:val="center"/>
+            </w:pPr>
+            <w:r>
+              <w:rPr>
+                <w:color w:val="000000"/>
+                <w:szCs w:val="26"/>
+              </w:rPr>
+              <w:t>5</w:t>
+            </w:r>
+          </w:p>
+        </w:tc>
+        <w:tc>
+          <w:tcPr>
+            <w:tcW w:w="1984" w:type="dxa"/>
+          </w:tcPr>
+          <w:p>
+            <w:pPr>
+              <w:jc w:val="center"/>
+            </w:pPr>
+            <w:r>
+              <w:rPr>
+                <w:color w:val="000000"/>
+                <w:szCs w:val="26"/>
+              </w:rPr>
+              <w:t>Cấp mã hồ sơ</w:t>
+            </w:r>
+          </w:p>
+        </w:tc>
+        <w:tc>
+          <w:tcPr>
+            <w:tcW w:w="1677" w:type="dxa"/>
+          </w:tcPr>
+          <w:p>
+            <w:pPr>
+              <w:jc w:val="center"/>
+            </w:pPr>
+            <w:r>
+              <w:rPr>
+                <w:color w:val="000000"/>
+                <w:szCs w:val="26"/>
+              </w:rPr>
+              <w:t>Overdo</w:t>
+            </w:r>
+          </w:p>
+        </w:tc>
+        <w:tc>
+          <w:tcPr>
+            <w:tcW w:w="1503" w:type="dxa"/>
+          </w:tcPr>
+          <w:p>
+            <w:pPr>
+              <w:jc w:val="center"/>
+            </w:pPr>
+            <w:r>
+              <w:rPr>
+                <w:color w:val="000000"/>
+                <w:szCs w:val="26"/>
+              </w:rPr>
+              <w:t>Tạo mã thủ công</w:t>
+            </w:r>
+          </w:p>
+        </w:tc>
+        <w:tc>
+          <w:tcPr>
+            <w:tcW w:w="1503" w:type="dxa"/>
+          </w:tcPr>
+          <w:p>
+            <w:pPr>
+              <w:jc w:val="center"/>
+            </w:pPr>
+            <w:r>
+              <w:rPr>
+                <w:color w:val="000000"/>
+                <w:szCs w:val="26"/>
+              </w:rPr>
+              <w:t>Nếu cán bộ phải nhập hoặc tạo mã thủ công sẽ phát sinh thêm thao tác và có nguy cơ sai mã.</w:t>
+            </w:r>
+          </w:p>
+        </w:tc>
+        <w:tc>
+          <w:tcPr>
+            <w:tcW w:w="1503" w:type="dxa"/>
+          </w:tcPr>
+          <w:p>
+            <w:pPr>
+              <w:jc w:val="center"/>
+            </w:pPr>
+            <w:r>
+              <w:rPr>
+                <w:color w:val="000000"/>
+                <w:szCs w:val="26"/>
+              </w:rPr>
+              <w:t>Hệ thống tự động sinh mã hồ sơ ngay sau khi tiếp nhận.</w:t>
+            </w:r>
+          </w:p>
+        </w:tc>
+      </w:tr>
+      <w:tr>
+        <w:tc>
+          <w:tcPr>
+            <w:tcW w:w="846" w:type="dxa"/>
+          </w:tcPr>
+          <w:p>
+            <w:pPr>
+              <w:jc w:val="center"/>
+            </w:pPr>
+            <w:r>
+              <w:rPr>
+                <w:color w:val="000000"/>
+                <w:szCs w:val="26"/>
+              </w:rPr>
+              <w:t>6</w:t>
+            </w:r>
+          </w:p>
+        </w:tc>
+        <w:tc>
+          <w:tcPr>
+            <w:tcW w:w="1984" w:type="dxa"/>
+          </w:tcPr>
+          <w:p>
+            <w:pPr>
+              <w:jc w:val="center"/>
+            </w:pPr>
+            <w:r>
+              <w:rPr>
+                <w:color w:val="000000"/>
+                <w:szCs w:val="26"/>
+              </w:rPr>
+              <w:t>Kiểm tra tài khoản DVCQG</w:t>
+            </w:r>
+          </w:p>
+        </w:tc>
+        <w:tc>
+          <w:tcPr>
+            <w:tcW w:w="1677" w:type="dxa"/>
+          </w:tcPr>
+          <w:p>
+            <w:pPr>
+              <w:jc w:val="center"/>
+            </w:pPr>
+            <w:r>
+              <w:rPr>
+                <w:color w:val="000000"/>
+                <w:szCs w:val="26"/>
+              </w:rPr>
+              <w:t>Overdo</w:t>
+            </w:r>
+          </w:p>
+        </w:tc>
+        <w:tc>
+          <w:tcPr>
+            <w:tcW w:w="1503" w:type="dxa"/>
+          </w:tcPr>
+          <w:p>
+            <w:pPr>
+              <w:jc w:val="center"/>
+            </w:pPr>
+            <w:r>
+              <w:rPr>
+                <w:color w:val="000000"/>
+                <w:szCs w:val="26"/>
+              </w:rPr>
+              <w:t>Kiểm tra lại thông tin định danh</w:t>
+            </w:r>
+          </w:p>
+        </w:tc>
+        <w:tc>
+          <w:tcPr>
+            <w:tcW w:w="1503" w:type="dxa"/>
+          </w:tcPr>
+          <w:p>
+            <w:pPr>
+              <w:jc w:val="center"/>
+            </w:pPr>
+            <w:r>
+              <w:rPr>
+                <w:color w:val="000000"/>
+                <w:szCs w:val="26"/>
+              </w:rPr>
+              <w:t>Thông tin cá nhân có thể đã tồn tại nhưng cán bộ vẫn phải thực hiện kiểm tra thủ công.</w:t>
+            </w:r>
+          </w:p>
+        </w:tc>
+        <w:tc>
+          <w:tcPr>
+            <w:tcW w:w="1503" w:type="dxa"/>
+          </w:tcPr>
+          <w:p>
+            <w:pPr>
+              <w:jc w:val="center"/>
+            </w:pPr>
+            <w:r>
+              <w:rPr>
+                <w:color w:val="000000"/>
+                <w:szCs w:val="26"/>
+              </w:rPr>
+              <w:t>Tự động xác thực tài khoản bằng mã định danh.</w:t>
+            </w:r>
+          </w:p>
+        </w:tc>
+      </w:tr>
+      <w:tr>
+        <w:tc>
+          <w:tcPr>
+            <w:tcW w:w="846" w:type="dxa"/>
+          </w:tcPr>
+          <w:p>
+            <w:pPr>
+              <w:jc w:val="center"/>
+            </w:pPr>
+            <w:r>
+              <w:rPr>
+                <w:color w:val="000000"/>
+                <w:szCs w:val="26"/>
+              </w:rPr>
+              <w:t>7</w:t>
+            </w:r>
+          </w:p>
+        </w:tc>
+        <w:tc>
+          <w:tcPr>
+            <w:tcW w:w="1984" w:type="dxa"/>
+          </w:tcPr>
+          <w:p>
+            <w:pPr>
+              <w:jc w:val="center"/>
+            </w:pPr>
+            <w:r>
+              <w:rPr>
+                <w:color w:val="000000"/>
+                <w:szCs w:val="26"/>
+              </w:rPr>
+              <w:t>Hỗ trợ tạo tài khoản DVCQG</w:t>
+            </w:r>
+          </w:p>
+        </w:tc>
+        <w:tc>
+          <w:tcPr>
+            <w:tcW w:w="1677" w:type="dxa"/>
+          </w:tcPr>
+          <w:p>
+            <w:pPr>
+              <w:jc w:val="center"/>
+            </w:pPr>
+            <w:r>
+              <w:rPr>
+                <w:color w:val="000000"/>
+                <w:szCs w:val="26"/>
+              </w:rPr>
+              <w:t>Hold</w:t>
+            </w:r>
+          </w:p>
+        </w:tc>
+        <w:tc>
+          <w:tcPr>
+            <w:tcW w:w="1503" w:type="dxa"/>
+          </w:tcPr>
+          <w:p>
+            <w:pPr>
+              <w:jc w:val="center"/>
+            </w:pPr>
+            <w:r>
+              <w:rPr>
+                <w:color w:val="000000"/>
+                <w:szCs w:val="26"/>
+              </w:rPr>
+              <w:t>Chờ tạo/xác thực tài khoản</w:t>
+            </w:r>
+          </w:p>
+        </w:tc>
+        <w:tc>
+          <w:tcPr>
+            <w:tcW w:w="1503" w:type="dxa"/>
+          </w:tcPr>
+          <w:p>
+            <w:pPr>
+              <w:jc w:val="center"/>
+            </w:pPr>
+            <w:r>
+              <w:rPr>
+                <w:color w:val="000000"/>
+                <w:szCs w:val="26"/>
+              </w:rPr>
+              <w:t xml:space="preserve">Hồ sơ phải tạm dừng trong lúc người dân tạo hoặc </w:t>
+            </w:r>
+            <w:r>
+              <w:rPr>
+                <w:color w:val="000000"/>
+                <w:szCs w:val="26"/>
+              </w:rPr>
+              <w:lastRenderedPageBreak/>
+              <w:t>xác thực tài khoản.</w:t>
+            </w:r>
+          </w:p>
+        </w:tc>
+        <w:tc>
+          <w:tcPr>
+            <w:tcW w:w="1503" w:type="dxa"/>
+          </w:tcPr>
+          <w:p>
+            <w:pPr>
+              <w:jc w:val="center"/>
+            </w:pPr>
+            <w:r>
+              <w:rPr>
+                <w:color w:val="000000"/>
+                <w:szCs w:val="26"/>
+              </w:rPr>
+              <w:lastRenderedPageBreak/>
+              <w:t xml:space="preserve">Hướng dẫn người dân tạo tài khoản trước khi nộp; sử </w:t>
+            </w:r>
+            <w:r>
+              <w:rPr>
+                <w:color w:val="000000"/>
+                <w:szCs w:val="26"/>
+              </w:rPr>
+              <w:lastRenderedPageBreak/>
+              <w:t>dụng định danh điện tử.</w:t>
+            </w:r>
+          </w:p>
+        </w:tc>
+      </w:tr>
+      <w:tr>
+        <w:tc>
+          <w:tcPr>
+            <w:tcW w:w="846" w:type="dxa"/>
+          </w:tcPr>
+          <w:p>
+            <w:pPr>
+              <w:jc w:val="center"/>
+            </w:pPr>
+            <w:r>
+              <w:rPr>
+                <w:color w:val="000000"/>
+                <w:szCs w:val="26"/>
+              </w:rPr>
+              <w:lastRenderedPageBreak/>
+              <w:t>8</w:t>
+            </w:r>
+          </w:p>
+        </w:tc>
+        <w:tc>
+          <w:tcPr>
+            <w:tcW w:w="1984" w:type="dxa"/>
+          </w:tcPr>
+          <w:p>
+            <w:pPr>
+              <w:jc w:val="center"/>
+            </w:pPr>
+            <w:r>
+              <w:rPr>
+                <w:color w:val="000000"/>
+                <w:szCs w:val="26"/>
+              </w:rPr>
+              <w:t>Kiểm tra tài khoản HTTT giải quyết TTHC</w:t>
+            </w:r>
+          </w:p>
+        </w:tc>
+        <w:tc>
+          <w:tcPr>
+            <w:tcW w:w="1677" w:type="dxa"/>
+          </w:tcPr>
+          <w:p>
+            <w:pPr>
+              <w:jc w:val="center"/>
+            </w:pPr>
+            <w:r>
+              <w:rPr>
+                <w:color w:val="000000"/>
+                <w:szCs w:val="26"/>
+              </w:rPr>
+              <w:t>Overdo</w:t>
+            </w:r>
+          </w:p>
+        </w:tc>
+        <w:tc>
+          <w:tcPr>
+            <w:tcW w:w="1503" w:type="dxa"/>
+          </w:tcPr>
+          <w:p>
+            <w:pPr>
+              <w:jc w:val="center"/>
+            </w:pPr>
+            <w:r>
+              <w:rPr>
+                <w:color w:val="000000"/>
+                <w:szCs w:val="26"/>
+              </w:rPr>
+              <w:t>Kiểm tra trên hệ thống thứ hai</w:t>
+            </w:r>
+          </w:p>
+        </w:tc>
+        <w:tc>
+          <w:tcPr>
+            <w:tcW w:w="1503" w:type="dxa"/>
+          </w:tcPr>
+          <w:p>
+            <w:pPr>
+              <w:jc w:val="center"/>
+            </w:pPr>
+            <w:r>
+              <w:rPr>
+                <w:color w:val="000000"/>
+                <w:szCs w:val="26"/>
+              </w:rPr>
+              <w:t>Có thể trùng lặp với việc kiểm tra tài khoản DVCQG.</w:t>
+            </w:r>
+          </w:p>
+        </w:tc>
+        <w:tc>
+          <w:tcPr>
+            <w:tcW w:w="1503" w:type="dxa"/>
+          </w:tcPr>
+          <w:p>
+            <w:pPr>
+              <w:jc w:val="center"/>
+            </w:pPr>
+            <w:r>
+              <w:rPr>
+                <w:color w:val="000000"/>
+                <w:szCs w:val="26"/>
+              </w:rPr>
+              <w:t>Đồng bộ tài khoản giữa DVCQG và HTTT giải quyết TTHC.</w:t>
+            </w:r>
+          </w:p>
+        </w:tc>
+      </w:tr>
+      <w:tr>
+        <w:tc>
+          <w:tcPr>
+            <w:tcW w:w="846" w:type="dxa"/>
+          </w:tcPr>
+          <w:p>
+            <w:pPr>
+              <w:jc w:val="center"/>
+            </w:pPr>
+            <w:r>
+              <w:rPr>
+                <w:color w:val="000000"/>
+                <w:szCs w:val="26"/>
+              </w:rPr>
+              <w:t>9</w:t>
+            </w:r>
+          </w:p>
+        </w:tc>
+        <w:tc>
+          <w:tcPr>
+            <w:tcW w:w="1984" w:type="dxa"/>
+          </w:tcPr>
+          <w:p>
+            <w:pPr>
+              <w:jc w:val="center"/>
+            </w:pPr>
+            <w:r>
+              <w:rPr>
+                <w:color w:val="000000"/>
+                <w:szCs w:val="26"/>
+              </w:rPr>
+              <w:t>Cấp quyền/Tạo và liên kết tài khoản</w:t>
+            </w:r>
+          </w:p>
+        </w:tc>
+        <w:tc>
+          <w:tcPr>
+            <w:tcW w:w="1677" w:type="dxa"/>
+          </w:tcPr>
+          <w:p>
+            <w:pPr>
+              <w:jc w:val="center"/>
+            </w:pPr>
+            <w:r>
+              <w:rPr>
+                <w:color w:val="000000"/>
+                <w:szCs w:val="26"/>
+              </w:rPr>
+              <w:t>Overdo</w:t>
+            </w:r>
+          </w:p>
+        </w:tc>
+        <w:tc>
+          <w:tcPr>
+            <w:tcW w:w="1503" w:type="dxa"/>
+          </w:tcPr>
+          <w:p>
+            <w:pPr>
+              <w:jc w:val="center"/>
+            </w:pPr>
+            <w:r>
+              <w:rPr>
+                <w:color w:val="000000"/>
+                <w:szCs w:val="26"/>
+              </w:rPr>
+              <w:t>Tạo/liên kết tài khoản thủ công</w:t>
+            </w:r>
+          </w:p>
+        </w:tc>
+        <w:tc>
+          <w:tcPr>
+            <w:tcW w:w="1503" w:type="dxa"/>
+          </w:tcPr>
+          <w:p>
+            <w:pPr>
+              <w:jc w:val="center"/>
+            </w:pPr>
+            <w:r>
+              <w:rPr>
+                <w:color w:val="000000"/>
+                <w:szCs w:val="26"/>
+              </w:rPr>
+              <w:t>Việc tạo và liên kết tài khoản làm phát sinh thêm bước xử lý nội bộ.</w:t>
+            </w:r>
+          </w:p>
+        </w:tc>
+        <w:tc>
+          <w:tcPr>
+            <w:tcW w:w="1503" w:type="dxa"/>
+          </w:tcPr>
+          <w:p>
+            <w:pPr>
+              <w:jc w:val="center"/>
+            </w:pPr>
+            <w:r>
+              <w:rPr>
+                <w:color w:val="000000"/>
+                <w:szCs w:val="26"/>
+              </w:rPr>
+              <w:t>Tự động tạo và liên kết tài khoản thông qua mã định danh.</w:t>
+            </w:r>
+          </w:p>
+        </w:tc>
+      </w:tr>
+      <w:tr>
+        <w:tc>
+          <w:tcPr>
+            <w:tcW w:w="846" w:type="dxa"/>
+          </w:tcPr>
+          <w:p>
+            <w:pPr>
+              <w:jc w:val="center"/>
+            </w:pPr>
+            <w:r>
+              <w:rPr>
+                <w:color w:val="000000"/>
+                <w:szCs w:val="26"/>
+              </w:rPr>
+              <w:t>10</w:t>
+            </w:r>
+          </w:p>
+        </w:tc>
+        <w:tc>
+          <w:tcPr>
+            <w:tcW w:w="1984" w:type="dxa"/>
+          </w:tcPr>
+          <w:p>
+            <w:pPr>
+              <w:jc w:val="center"/>
+            </w:pPr>
+            <w:r>
+              <w:rPr>
+                <w:color w:val="000000"/>
+                <w:szCs w:val="26"/>
+              </w:rPr>
+              <w:t>Nhập thông tin hồ sơ</w:t>
+            </w:r>
+          </w:p>
+        </w:tc>
+        <w:tc>
+          <w:tcPr>
+            <w:tcW w:w="1677" w:type="dxa"/>
+          </w:tcPr>
+          <w:p>
+            <w:pPr>
+              <w:jc w:val="center"/>
+            </w:pPr>
+            <w:r>
+              <w:rPr>
+                <w:color w:val="000000"/>
+                <w:szCs w:val="26"/>
+              </w:rPr>
+              <w:t>Overdo</w:t>
+            </w:r>
+          </w:p>
+        </w:tc>
+        <w:tc>
+          <w:tcPr>
+            <w:tcW w:w="1503" w:type="dxa"/>
+          </w:tcPr>
+          <w:p>
+            <w:pPr>
+              <w:jc w:val="center"/>
+            </w:pPr>
+            <w:r>
+              <w:rPr>
+                <w:color w:val="000000"/>
+                <w:szCs w:val="26"/>
+              </w:rPr>
+              <w:t>Nhập lại dữ liệu</w:t>
+            </w:r>
+          </w:p>
+        </w:tc>
+        <w:tc>
+          <w:tcPr>
+            <w:tcW w:w="1503" w:type="dxa"/>
+          </w:tcPr>
+          <w:p>
+            <w:pPr>
+              <w:jc w:val="center"/>
+            </w:pPr>
+            <w:r>
+              <w:rPr>
+                <w:color w:val="000000"/>
+                <w:szCs w:val="26"/>
+              </w:rPr>
+              <w:t>Cán bộ có thể nhập lại các thông tin người dân đã kê khai hoặc dữ liệu đã có trong CSDL.</w:t>
+            </w:r>
+          </w:p>
+        </w:tc>
+        <w:tc>
+          <w:tcPr>
+            <w:tcW w:w="1503" w:type="dxa"/>
+          </w:tcPr>
+          <w:p>
+            <w:pPr>
+              <w:jc w:val="center"/>
+            </w:pPr>
+            <w:r>
+              <w:rPr>
+                <w:color w:val="000000"/>
+                <w:szCs w:val="26"/>
+              </w:rPr>
+              <w:t>Tự động lấy và điền dữ liệu từ CSDL và hồ sơ điện tử.</w:t>
+            </w:r>
+          </w:p>
+        </w:tc>
+      </w:tr>
+      <w:tr>
+        <w:tc>
+          <w:tcPr>
+            <w:tcW w:w="846" w:type="dxa"/>
+          </w:tcPr>
+          <w:p>
+            <w:pPr>
+              <w:jc w:val="center"/>
+            </w:pPr>
+            <w:r>
+              <w:rPr>
+                <w:color w:val="000000"/>
+                <w:szCs w:val="26"/>
+              </w:rPr>
+              <w:t>11</w:t>
+            </w:r>
+          </w:p>
+        </w:tc>
+        <w:tc>
+          <w:tcPr>
+            <w:tcW w:w="1984" w:type="dxa"/>
+          </w:tcPr>
+          <w:p>
+            <w:pPr>
+              <w:jc w:val="center"/>
+            </w:pPr>
+            <w:r>
+              <w:rPr>
+                <w:color w:val="000000"/>
+                <w:szCs w:val="26"/>
+              </w:rPr>
+              <w:t>Kiểm tra hồ sơ</w:t>
+            </w:r>
+          </w:p>
+        </w:tc>
+        <w:tc>
+          <w:tcPr>
+            <w:tcW w:w="1677" w:type="dxa"/>
+          </w:tcPr>
+          <w:p>
+            <w:pPr>
+              <w:jc w:val="center"/>
+            </w:pPr>
+            <w:r>
+              <w:rPr>
+                <w:color w:val="000000"/>
+                <w:szCs w:val="26"/>
+              </w:rPr>
+              <w:t>Overdo</w:t>
+            </w:r>
+          </w:p>
+        </w:tc>
+        <w:tc>
+          <w:tcPr>
+            <w:tcW w:w="1503" w:type="dxa"/>
+          </w:tcPr>
+          <w:p>
+            <w:pPr>
+              <w:jc w:val="center"/>
+            </w:pPr>
+            <w:r>
+              <w:rPr>
+                <w:color w:val="000000"/>
+                <w:szCs w:val="26"/>
+              </w:rPr>
+              <w:t>Kiểm tra lặp</w:t>
+            </w:r>
+          </w:p>
+        </w:tc>
+        <w:tc>
+          <w:tcPr>
+            <w:tcW w:w="1503" w:type="dxa"/>
+          </w:tcPr>
+          <w:p>
+            <w:pPr>
+              <w:jc w:val="center"/>
+            </w:pPr>
+            <w:r>
+              <w:rPr>
+                <w:color w:val="000000"/>
+                <w:szCs w:val="26"/>
+              </w:rPr>
+              <w:t>Một số thông tin, giấy tờ có thể được kiểm tra lại dù đã được xác thực ở bước trước hoặc trên hệ thống khác.</w:t>
+            </w:r>
+          </w:p>
+        </w:tc>
+        <w:tc>
+          <w:tcPr>
+            <w:tcW w:w="1503" w:type="dxa"/>
+          </w:tcPr>
+          <w:p>
+            <w:pPr>
+              <w:jc w:val="center"/>
+            </w:pPr>
+            <w:r>
+              <w:rPr>
+                <w:color w:val="000000"/>
+                <w:szCs w:val="26"/>
+              </w:rPr>
+              <w:t>Tự động đối chiếu dữ liệu, cán bộ chỉ kiểm tra các trường hợp ngoại lệ.</w:t>
+            </w:r>
+          </w:p>
+        </w:tc>
+      </w:tr>
+      <w:tr>
+        <w:tc>
+          <w:tcPr>
+            <w:tcW w:w="846" w:type="dxa"/>
+          </w:tcPr>
+          <w:p>
+            <w:pPr>
+              <w:jc w:val="center"/>
+            </w:pPr>
+            <w:r>
+              <w:rPr>
+                <w:color w:val="000000"/>
+                <w:szCs w:val="26"/>
+              </w:rPr>
+              <w:t>12</w:t>
+            </w:r>
+          </w:p>
+        </w:tc>
+        <w:tc>
+          <w:tcPr>
+            <w:tcW w:w="1984" w:type="dxa"/>
+          </w:tcPr>
+          <w:p>
+            <w:pPr>
+              <w:jc w:val="center"/>
+            </w:pPr>
+            <w:r>
+              <w:rPr>
+                <w:color w:val="000000"/>
+                <w:szCs w:val="26"/>
+              </w:rPr>
+              <w:t>Yêu cầu bổ sung</w:t>
+            </w:r>
+          </w:p>
+        </w:tc>
+        <w:tc>
+          <w:tcPr>
+            <w:tcW w:w="1677" w:type="dxa"/>
+          </w:tcPr>
+          <w:p>
+            <w:pPr>
+              <w:jc w:val="center"/>
+            </w:pPr>
+            <w:r>
+              <w:rPr>
+                <w:color w:val="000000"/>
+                <w:szCs w:val="26"/>
+              </w:rPr>
+              <w:t>Hold</w:t>
+            </w:r>
+          </w:p>
+        </w:tc>
+        <w:tc>
+          <w:tcPr>
+            <w:tcW w:w="1503" w:type="dxa"/>
+          </w:tcPr>
+          <w:p>
+            <w:pPr>
+              <w:jc w:val="center"/>
+            </w:pPr>
+            <w:r>
+              <w:rPr>
+                <w:color w:val="000000"/>
+                <w:szCs w:val="26"/>
+              </w:rPr>
+              <w:t>Chờ bổ sung hồ sơ</w:t>
+            </w:r>
+          </w:p>
+        </w:tc>
+        <w:tc>
+          <w:tcPr>
+            <w:tcW w:w="1503" w:type="dxa"/>
+          </w:tcPr>
+          <w:p>
+            <w:pPr>
+              <w:jc w:val="center"/>
+            </w:pPr>
+            <w:r>
+              <w:rPr>
+                <w:color w:val="000000"/>
+                <w:szCs w:val="26"/>
+              </w:rPr>
+              <w:t>Hồ sơ bị dừng xử lý để chờ người dân hoàn thiện tài liệu còn thiếu.</w:t>
+            </w:r>
+          </w:p>
+        </w:tc>
+        <w:tc>
+          <w:tcPr>
+            <w:tcW w:w="1503" w:type="dxa"/>
+          </w:tcPr>
+          <w:p>
+            <w:pPr>
+              <w:jc w:val="center"/>
+            </w:pPr>
+            <w:r>
+              <w:rPr>
+                <w:color w:val="000000"/>
+                <w:szCs w:val="26"/>
+              </w:rPr>
+              <w:t>Kiểm tra đầu vào kỹ hơn và thông báo đầy đủ nội dung cần bổ sung ngay một lần.</w:t>
+            </w:r>
+          </w:p>
+        </w:tc>
+      </w:tr>
+      <w:tr>
+        <w:tc>
+          <w:tcPr>
+            <w:tcW w:w="846" w:type="dxa"/>
+          </w:tcPr>
+          <w:p>
+            <w:pPr>
+              <w:jc w:val="center"/>
+            </w:pPr>
+            <w:r>
+              <w:rPr>
+                <w:color w:val="000000"/>
+                <w:szCs w:val="26"/>
+              </w:rPr>
+              <w:t>13</w:t>
+            </w:r>
+          </w:p>
+        </w:tc>
+        <w:tc>
+          <w:tcPr>
+            <w:tcW w:w="1984" w:type="dxa"/>
+          </w:tcPr>
+          <w:p>
+            <w:pPr>
+              <w:jc w:val="center"/>
+            </w:pPr>
+            <w:r>
+              <w:rPr>
+                <w:color w:val="000000"/>
+                <w:szCs w:val="26"/>
+              </w:rPr>
+              <w:t>Bổ sung hồ sơ</w:t>
+            </w:r>
+          </w:p>
+        </w:tc>
+        <w:tc>
+          <w:tcPr>
+            <w:tcW w:w="1677" w:type="dxa"/>
+          </w:tcPr>
+          <w:p>
+            <w:pPr>
+              <w:jc w:val="center"/>
+            </w:pPr>
+            <w:r>
+              <w:rPr>
+                <w:color w:val="000000"/>
+                <w:szCs w:val="26"/>
+              </w:rPr>
+              <w:t>Move / Hold</w:t>
+            </w:r>
+          </w:p>
+        </w:tc>
+        <w:tc>
+          <w:tcPr>
+            <w:tcW w:w="1503" w:type="dxa"/>
+          </w:tcPr>
+          <w:p>
+            <w:pPr>
+              <w:jc w:val="center"/>
+            </w:pPr>
+            <w:r>
+              <w:rPr>
+                <w:color w:val="000000"/>
+                <w:szCs w:val="26"/>
+              </w:rPr>
+              <w:t>Gửi lại và chờ bổ sung</w:t>
+            </w:r>
+          </w:p>
+        </w:tc>
+        <w:tc>
+          <w:tcPr>
+            <w:tcW w:w="1503" w:type="dxa"/>
+          </w:tcPr>
+          <w:p>
+            <w:pPr>
+              <w:jc w:val="center"/>
+            </w:pPr>
+            <w:r>
+              <w:rPr>
+                <w:color w:val="000000"/>
+                <w:szCs w:val="26"/>
+              </w:rPr>
+              <w:t xml:space="preserve">Người dân phải gửi thêm tài </w:t>
+            </w:r>
+            <w:r>
+              <w:rPr>
+                <w:color w:val="000000"/>
+                <w:szCs w:val="26"/>
+              </w:rPr>
+              <w:lastRenderedPageBreak/>
+              <w:t>liệu hoặc quay lại cơ quan; đồng thời quy trình phải chờ đến khi hoàn tất bổ sung.</w:t>
+            </w:r>
+          </w:p>
+        </w:tc>
+        <w:tc>
+          <w:tcPr>
+            <w:tcW w:w="1503" w:type="dxa"/>
+          </w:tcPr>
+          <w:p>
+            <w:pPr>
+              <w:jc w:val="center"/>
+            </w:pPr>
+            <w:r>
+              <w:rPr>
+                <w:color w:val="000000"/>
+                <w:szCs w:val="26"/>
+              </w:rPr>
+              <w:lastRenderedPageBreak/>
+              <w:t xml:space="preserve">Cho phép bổ sung trực tuyến, </w:t>
+            </w:r>
+            <w:r>
+              <w:rPr>
+                <w:color w:val="000000"/>
+                <w:szCs w:val="26"/>
+              </w:rPr>
+              <w:lastRenderedPageBreak/>
+              <w:t>thông báo chính xác tài liệu còn thiếu.</w:t>
+            </w:r>
+          </w:p>
+        </w:tc>
+      </w:tr>
+      <w:tr>
+        <w:tc>
+          <w:tcPr>
+            <w:tcW w:w="846" w:type="dxa"/>
+          </w:tcPr>
+          <w:p>
+            <w:pPr>
+              <w:jc w:val="center"/>
+            </w:pPr>
+            <w:r>
+              <w:rPr>
+                <w:color w:val="000000"/>
+                <w:szCs w:val="26"/>
+              </w:rPr>
+              <w:lastRenderedPageBreak/>
+              <w:t>14</w:t>
+            </w:r>
+          </w:p>
+        </w:tc>
+        <w:tc>
+          <w:tcPr>
+            <w:tcW w:w="1984" w:type="dxa"/>
+          </w:tcPr>
+          <w:p>
+            <w:pPr>
+              <w:jc w:val="center"/>
+            </w:pPr>
+            <w:r>
+              <w:rPr>
+                <w:color w:val="000000"/>
+                <w:szCs w:val="26"/>
+              </w:rPr>
+              <w:t>Từ chối tiếp nhận</w:t>
+            </w:r>
+          </w:p>
+        </w:tc>
+        <w:tc>
+          <w:tcPr>
+            <w:tcW w:w="1677" w:type="dxa"/>
+          </w:tcPr>
+          <w:p>
+            <w:pPr>
+              <w:jc w:val="center"/>
+            </w:pPr>
+            <w:r>
+              <w:rPr>
+                <w:color w:val="000000"/>
+                <w:szCs w:val="26"/>
+              </w:rPr>
+              <w:t>Overdo</w:t>
+            </w:r>
+          </w:p>
+        </w:tc>
+        <w:tc>
+          <w:tcPr>
+            <w:tcW w:w="1503" w:type="dxa"/>
+          </w:tcPr>
+          <w:p>
+            <w:pPr>
+              <w:jc w:val="center"/>
+            </w:pPr>
+            <w:r>
+              <w:rPr>
+                <w:color w:val="000000"/>
+                <w:szCs w:val="26"/>
+              </w:rPr>
+              <w:t>Xử lý thừa nếu phát hiện muộn</w:t>
+            </w:r>
+          </w:p>
+        </w:tc>
+        <w:tc>
+          <w:tcPr>
+            <w:tcW w:w="1503" w:type="dxa"/>
+          </w:tcPr>
+          <w:p>
+            <w:pPr>
+              <w:jc w:val="center"/>
+            </w:pPr>
+            <w:r>
+              <w:rPr>
+                <w:color w:val="000000"/>
+                <w:szCs w:val="26"/>
+              </w:rPr>
+              <w:t>Nếu sai thẩm quyền hoặc không đủ điều kiện chỉ được phát hiện sau nhiều bước thì các thao tác trước đó trở thành lãng phí.</w:t>
+            </w:r>
+          </w:p>
+        </w:tc>
+        <w:tc>
+          <w:tcPr>
+            <w:tcW w:w="1503" w:type="dxa"/>
+          </w:tcPr>
+          <w:p>
+            <w:pPr>
+              <w:jc w:val="center"/>
+            </w:pPr>
+            <w:r>
+              <w:rPr>
+                <w:color w:val="000000"/>
+                <w:szCs w:val="26"/>
+              </w:rPr>
+              <w:t>Kiểm tra thẩm quyền và điều kiện cơ bản ngay từ đầu quy trình.</w:t>
+            </w:r>
+          </w:p>
+        </w:tc>
+      </w:tr>
+      <w:tr>
+        <w:tc>
+          <w:tcPr>
+            <w:tcW w:w="846" w:type="dxa"/>
+          </w:tcPr>
+          <w:p>
+            <w:pPr>
+              <w:jc w:val="center"/>
+            </w:pPr>
+            <w:r>
+              <w:rPr>
+                <w:color w:val="000000"/>
+                <w:szCs w:val="26"/>
+              </w:rPr>
+              <w:t>15</w:t>
+            </w:r>
+          </w:p>
+        </w:tc>
+        <w:tc>
+          <w:tcPr>
+            <w:tcW w:w="1984" w:type="dxa"/>
+          </w:tcPr>
+          <w:p>
+            <w:pPr>
+              <w:jc w:val="center"/>
+            </w:pPr>
+            <w:r>
+              <w:rPr>
+                <w:color w:val="000000"/>
+                <w:szCs w:val="26"/>
+              </w:rPr>
+              <w:t>Kiểm tra chứng thực điện tử</w:t>
+            </w:r>
+          </w:p>
+        </w:tc>
+        <w:tc>
+          <w:tcPr>
+            <w:tcW w:w="1677" w:type="dxa"/>
+          </w:tcPr>
+          <w:p>
+            <w:pPr>
+              <w:jc w:val="center"/>
+            </w:pPr>
+            <w:r>
+              <w:rPr>
+                <w:color w:val="000000"/>
+                <w:szCs w:val="26"/>
+              </w:rPr>
+              <w:t>Overdo</w:t>
+            </w:r>
+          </w:p>
+        </w:tc>
+        <w:tc>
+          <w:tcPr>
+            <w:tcW w:w="1503" w:type="dxa"/>
+          </w:tcPr>
+          <w:p>
+            <w:pPr>
+              <w:jc w:val="center"/>
+            </w:pPr>
+            <w:r>
+              <w:rPr>
+                <w:color w:val="000000"/>
+                <w:szCs w:val="26"/>
+              </w:rPr>
+              <w:t>Kiểm tra thủ công</w:t>
+            </w:r>
+          </w:p>
+        </w:tc>
+        <w:tc>
+          <w:tcPr>
+            <w:tcW w:w="1503" w:type="dxa"/>
+          </w:tcPr>
+          <w:p>
+            <w:pPr>
+              <w:jc w:val="center"/>
+            </w:pPr>
+            <w:r>
+              <w:rPr>
+                <w:color w:val="000000"/>
+                <w:szCs w:val="26"/>
+              </w:rPr>
+              <w:t>Nếu cán bộ phải kiểm tra từng tài liệu bằng tay sẽ làm tăng thời gian xử lý.</w:t>
+            </w:r>
+          </w:p>
+        </w:tc>
+        <w:tc>
+          <w:tcPr>
+            <w:tcW w:w="1503" w:type="dxa"/>
+          </w:tcPr>
+          <w:p>
+            <w:pPr>
+              <w:jc w:val="center"/>
+            </w:pPr>
+            <w:r>
+              <w:rPr>
+                <w:color w:val="000000"/>
+                <w:szCs w:val="26"/>
+              </w:rPr>
+              <w:t>Kết nối hệ thống chứng thực/chữ ký số để xác minh tự động.</w:t>
+            </w:r>
+          </w:p>
+        </w:tc>
+      </w:tr>
+      <w:tr>
+        <w:tc>
+          <w:tcPr>
+            <w:tcW w:w="846" w:type="dxa"/>
+          </w:tcPr>
+          <w:p>
+            <w:pPr>
+              <w:jc w:val="center"/>
+            </w:pPr>
+            <w:r>
+              <w:rPr>
+                <w:color w:val="000000"/>
+                <w:szCs w:val="26"/>
+              </w:rPr>
+              <w:t>16</w:t>
+            </w:r>
+          </w:p>
+        </w:tc>
+        <w:tc>
+          <w:tcPr>
+            <w:tcW w:w="1984" w:type="dxa"/>
+          </w:tcPr>
+          <w:p>
+            <w:pPr>
+              <w:jc w:val="center"/>
+            </w:pPr>
+            <w:r>
+              <w:rPr>
+                <w:color w:val="000000"/>
+                <w:szCs w:val="26"/>
+              </w:rPr>
+              <w:t>Scan hồ sơ và đính kèm tệp</w:t>
+            </w:r>
+          </w:p>
+        </w:tc>
+        <w:tc>
+          <w:tcPr>
+            <w:tcW w:w="1677" w:type="dxa"/>
+          </w:tcPr>
+          <w:p>
+            <w:pPr>
+              <w:jc w:val="center"/>
+            </w:pPr>
+            <w:r>
+              <w:rPr>
+                <w:color w:val="000000"/>
+                <w:szCs w:val="26"/>
+              </w:rPr>
+              <w:t>Overdo</w:t>
+            </w:r>
+          </w:p>
+        </w:tc>
+        <w:tc>
+          <w:tcPr>
+            <w:tcW w:w="1503" w:type="dxa"/>
+          </w:tcPr>
+          <w:p>
+            <w:pPr>
+              <w:jc w:val="center"/>
+            </w:pPr>
+            <w:r>
+              <w:rPr>
+                <w:color w:val="000000"/>
+                <w:szCs w:val="26"/>
+              </w:rPr>
+              <w:t>Scan lại tài liệu</w:t>
+            </w:r>
+          </w:p>
+        </w:tc>
+        <w:tc>
+          <w:tcPr>
+            <w:tcW w:w="1503" w:type="dxa"/>
+          </w:tcPr>
+          <w:p>
+            <w:pPr>
+              <w:jc w:val="center"/>
+            </w:pPr>
+            <w:r>
+              <w:rPr>
+                <w:color w:val="000000"/>
+                <w:szCs w:val="26"/>
+              </w:rPr>
+              <w:t>Có thể scan lại tài liệu đã có bản điện tử hoặc đã tồn tại trong hệ thống.</w:t>
+            </w:r>
+          </w:p>
+        </w:tc>
+        <w:tc>
+          <w:tcPr>
+            <w:tcW w:w="1503" w:type="dxa"/>
+          </w:tcPr>
+          <w:p>
+            <w:pPr>
+              <w:jc w:val="center"/>
+            </w:pPr>
+            <w:r>
+              <w:rPr>
+                <w:color w:val="000000"/>
+                <w:szCs w:val="26"/>
+              </w:rPr>
+              <w:t>Tái sử dụng tài liệu điện tử đã có, chỉ scan tài liệu chưa được số hóa.</w:t>
+            </w:r>
+          </w:p>
+        </w:tc>
+      </w:tr>
+      <w:tr>
+        <w:tc>
+          <w:tcPr>
+            <w:tcW w:w="846" w:type="dxa"/>
+          </w:tcPr>
+          <w:p>
+            <w:pPr>
+              <w:jc w:val="center"/>
+            </w:pPr>
+            <w:r>
+              <w:rPr>
+                <w:color w:val="000000"/>
+                <w:szCs w:val="26"/>
+              </w:rPr>
+              <w:t>17</w:t>
+            </w:r>
+          </w:p>
+        </w:tc>
+        <w:tc>
+          <w:tcPr>
+            <w:tcW w:w="1984" w:type="dxa"/>
+          </w:tcPr>
+          <w:p>
+            <w:pPr>
+              <w:jc w:val="center"/>
+            </w:pPr>
+            <w:r>
+              <w:rPr>
+                <w:color w:val="000000"/>
+                <w:szCs w:val="26"/>
+              </w:rPr>
+              <w:t>Số hóa thành phần hồ sơ</w:t>
+            </w:r>
+          </w:p>
+        </w:tc>
+        <w:tc>
+          <w:tcPr>
+            <w:tcW w:w="1677" w:type="dxa"/>
+          </w:tcPr>
+          <w:p>
+            <w:pPr>
+              <w:jc w:val="center"/>
+            </w:pPr>
+            <w:r>
+              <w:rPr>
+                <w:color w:val="000000"/>
+                <w:szCs w:val="26"/>
+              </w:rPr>
+              <w:t>Overdo</w:t>
+            </w:r>
+          </w:p>
+        </w:tc>
+        <w:tc>
+          <w:tcPr>
+            <w:tcW w:w="1503" w:type="dxa"/>
+          </w:tcPr>
+          <w:p>
+            <w:pPr>
+              <w:jc w:val="center"/>
+            </w:pPr>
+            <w:r>
+              <w:rPr>
+                <w:color w:val="000000"/>
+                <w:szCs w:val="26"/>
+              </w:rPr>
+              <w:t>Xử lý trùng với scan</w:t>
+            </w:r>
+          </w:p>
+        </w:tc>
+        <w:tc>
+          <w:tcPr>
+            <w:tcW w:w="1503" w:type="dxa"/>
+          </w:tcPr>
+          <w:p>
+            <w:pPr>
+              <w:jc w:val="center"/>
+            </w:pPr>
+            <w:r>
+              <w:rPr>
+                <w:color w:val="000000"/>
+                <w:szCs w:val="26"/>
+              </w:rPr>
+              <w:t>Hoạt động số hóa có thể bị chồng chéo với việc scan và đính kèm tệp.</w:t>
+            </w:r>
+          </w:p>
+        </w:tc>
+        <w:tc>
+          <w:tcPr>
+            <w:tcW w:w="1503" w:type="dxa"/>
+          </w:tcPr>
+          <w:p>
+            <w:pPr>
+              <w:jc w:val="center"/>
+            </w:pPr>
+            <w:r>
+              <w:rPr>
+                <w:color w:val="000000"/>
+                <w:szCs w:val="26"/>
+              </w:rPr>
+              <w:t>Gộp scan và số hóa khi nghiệp vụ cho phép, sử dụng một lần cho nhiều bước.</w:t>
+            </w:r>
+          </w:p>
+        </w:tc>
+      </w:tr>
+      <w:tr>
+        <w:tc>
+          <w:tcPr>
+            <w:tcW w:w="846" w:type="dxa"/>
+          </w:tcPr>
+          <w:p>
+            <w:pPr>
+              <w:jc w:val="center"/>
+            </w:pPr>
+            <w:r>
+              <w:rPr>
+                <w:color w:val="000000"/>
+                <w:szCs w:val="26"/>
+              </w:rPr>
+              <w:t>18</w:t>
+            </w:r>
+          </w:p>
+        </w:tc>
+        <w:tc>
+          <w:tcPr>
+            <w:tcW w:w="1984" w:type="dxa"/>
+          </w:tcPr>
+          <w:p>
+            <w:pPr>
+              <w:jc w:val="center"/>
+            </w:pPr>
+            <w:r>
+              <w:rPr>
+                <w:color w:val="000000"/>
+                <w:szCs w:val="26"/>
+              </w:rPr>
+              <w:t>Ghi nhận hình thức trả kết quả</w:t>
+            </w:r>
+          </w:p>
+        </w:tc>
+        <w:tc>
+          <w:tcPr>
+            <w:tcW w:w="1677" w:type="dxa"/>
+          </w:tcPr>
+          <w:p>
+            <w:pPr>
+              <w:jc w:val="center"/>
+            </w:pPr>
+            <w:r>
+              <w:rPr>
+                <w:color w:val="000000"/>
+                <w:szCs w:val="26"/>
+              </w:rPr>
+              <w:t>Overdo</w:t>
+            </w:r>
+          </w:p>
+        </w:tc>
+        <w:tc>
+          <w:tcPr>
+            <w:tcW w:w="1503" w:type="dxa"/>
+          </w:tcPr>
+          <w:p>
+            <w:pPr>
+              <w:jc w:val="center"/>
+            </w:pPr>
+            <w:r>
+              <w:rPr>
+                <w:color w:val="000000"/>
+                <w:szCs w:val="26"/>
+              </w:rPr>
+              <w:t>Nhập lại lựa chọn</w:t>
+            </w:r>
+          </w:p>
+        </w:tc>
+        <w:tc>
+          <w:tcPr>
+            <w:tcW w:w="1503" w:type="dxa"/>
+          </w:tcPr>
+          <w:p>
+            <w:pPr>
+              <w:jc w:val="center"/>
+            </w:pPr>
+            <w:r>
+              <w:rPr>
+                <w:color w:val="000000"/>
+                <w:szCs w:val="26"/>
+              </w:rPr>
+              <w:t xml:space="preserve">Nếu người dân đã chọn hình thức trả kết quả lúc nộp </w:t>
+            </w:r>
+            <w:r>
+              <w:rPr>
+                <w:color w:val="000000"/>
+                <w:szCs w:val="26"/>
+              </w:rPr>
+              <w:lastRenderedPageBreak/>
+              <w:t>nhưng cán bộ vẫn nhập lại sẽ phát sinh thao tác thừa.</w:t>
+            </w:r>
+          </w:p>
+        </w:tc>
+        <w:tc>
+          <w:tcPr>
+            <w:tcW w:w="1503" w:type="dxa"/>
+          </w:tcPr>
+          <w:p>
+            <w:pPr>
+              <w:jc w:val="center"/>
+            </w:pPr>
+            <w:r>
+              <w:rPr>
+                <w:color w:val="000000"/>
+                <w:szCs w:val="26"/>
+              </w:rPr>
+              <w:lastRenderedPageBreak/>
+              <w:t xml:space="preserve">Cho phép người dân chọn ngay khi nộp và </w:t>
+            </w:r>
+            <w:r>
+              <w:rPr>
+                <w:color w:val="000000"/>
+                <w:szCs w:val="26"/>
+              </w:rPr>
+              <w:lastRenderedPageBreak/>
+              <w:t>hệ thống tự ghi nhận.</w:t>
+            </w:r>
+          </w:p>
+        </w:tc>
+      </w:tr>
+      <w:tr>
+        <w:tc>
+          <w:tcPr>
+            <w:tcW w:w="846" w:type="dxa"/>
+          </w:tcPr>
+          <w:p>
+            <w:pPr>
+              <w:jc w:val="center"/>
+            </w:pPr>
+            <w:r>
+              <w:rPr>
+                <w:color w:val="000000"/>
+                <w:szCs w:val="26"/>
+              </w:rPr>
+              <w:lastRenderedPageBreak/>
+              <w:t>19</w:t>
+            </w:r>
+          </w:p>
+        </w:tc>
+        <w:tc>
+          <w:tcPr>
+            <w:tcW w:w="1984" w:type="dxa"/>
+          </w:tcPr>
+          <w:p>
+            <w:pPr>
+              <w:jc w:val="center"/>
+            </w:pPr>
+            <w:r>
+              <w:rPr>
+                <w:color w:val="000000"/>
+                <w:szCs w:val="26"/>
+              </w:rPr>
+              <w:t>Lưu hồ sơ và cập nhật trạng thái</w:t>
+            </w:r>
+          </w:p>
+        </w:tc>
+        <w:tc>
+          <w:tcPr>
+            <w:tcW w:w="1677" w:type="dxa"/>
+          </w:tcPr>
+          <w:p>
+            <w:pPr>
+              <w:jc w:val="center"/>
+            </w:pPr>
+            <w:r>
+              <w:rPr>
+                <w:color w:val="000000"/>
+                <w:szCs w:val="26"/>
+              </w:rPr>
+              <w:t>Hold / Overdo</w:t>
+            </w:r>
+          </w:p>
+        </w:tc>
+        <w:tc>
+          <w:tcPr>
+            <w:tcW w:w="1503" w:type="dxa"/>
+          </w:tcPr>
+          <w:p>
+            <w:pPr>
+              <w:jc w:val="center"/>
+            </w:pPr>
+            <w:r>
+              <w:rPr>
+                <w:color w:val="000000"/>
+                <w:szCs w:val="26"/>
+              </w:rPr>
+              <w:t>Chờ lưu, đồng bộ và cập nhật trạng thái</w:t>
+            </w:r>
+          </w:p>
+        </w:tc>
+        <w:tc>
+          <w:tcPr>
+            <w:tcW w:w="1503" w:type="dxa"/>
+          </w:tcPr>
+          <w:p>
+            <w:pPr>
+              <w:jc w:val="center"/>
+            </w:pPr>
+            <w:r>
+              <w:rPr>
+                <w:color w:val="000000"/>
+                <w:szCs w:val="26"/>
+              </w:rPr>
+              <w:t>Hồ sơ có thể phải chờ hệ thống lưu, đồng bộ dữ liệu; nếu cán bộ phải cập nhật trạng thái thủ công thì phát sinh thêm thao tác.</w:t>
+            </w:r>
+          </w:p>
+        </w:tc>
+        <w:tc>
+          <w:tcPr>
+            <w:tcW w:w="1503" w:type="dxa"/>
+          </w:tcPr>
+          <w:p>
+            <w:pPr>
+              <w:jc w:val="center"/>
+            </w:pPr>
+            <w:r>
+              <w:rPr>
+                <w:color w:val="000000"/>
+                <w:szCs w:val="26"/>
+              </w:rPr>
+              <w:t>Tự động lưu, đồng bộ dữ liệu và tự động cập nhật trạng thái theo workflow ngay khi hoàn tất bước xử lý.</w:t>
+            </w:r>
+          </w:p>
+        </w:tc>
+      </w:tr>
+      <w:tr>
+        <w:tc>
+          <w:tcPr>
+            <w:tcW w:w="846" w:type="dxa"/>
+          </w:tcPr>
+          <w:p>
+            <w:pPr>
+              <w:jc w:val="center"/>
+            </w:pPr>
+          </w:p>
+        </w:tc>
+        <w:tc>
+          <w:tcPr>
+            <w:tcW w:w="1984" w:type="dxa"/>
+          </w:tcPr>
+          <w:p>
+            <w:pPr>
+              <w:jc w:val="center"/>
+            </w:pPr>
+          </w:p>
+        </w:tc>
+        <w:tc>
+          <w:tcPr>
+            <w:tcW w:w="1677" w:type="dxa"/>
+          </w:tcPr>
+          <w:p>
+            <w:pPr>
+              <w:jc w:val="center"/>
+            </w:pPr>
+          </w:p>
+        </w:tc>
+        <w:tc>
+          <w:tcPr>
+            <w:tcW w:w="1503" w:type="dxa"/>
+          </w:tcPr>
+          <w:p>
+            <w:pPr>
+              <w:jc w:val="center"/>
+            </w:pPr>
+          </w:p>
+        </w:tc>
+        <w:tc>
+          <w:tcPr>
+            <w:tcW w:w="1503" w:type="dxa"/>
+          </w:tcPr>
+          <w:p>
+            <w:pPr>
+              <w:jc w:val="center"/>
+            </w:pPr>
+          </w:p>
+        </w:tc>
+        <w:tc>
+          <w:tcPr>
+            <w:tcW w:w="1503" w:type="dxa"/>
+          </w:tcPr>
+          <w:p>
+            <w:pPr>
+              <w:jc w:val="center"/>
+            </w:pPr>
+          </w:p>
+        </w:tc>
+      </w:tr>
+      <w:tr>
+        <w:tc>
+          <w:tcPr>
+            <w:tcW w:w="846" w:type="dxa"/>
+          </w:tcPr>
+          <w:p>
+            <w:pPr>
+              <w:jc w:val="center"/>
+            </w:pPr>
+            <w:r>
+              <w:rPr>
+                <w:color w:val="000000"/>
+                <w:szCs w:val="26"/>
+              </w:rPr>
+              <w:t>21</w:t>
+            </w:r>
+          </w:p>
+        </w:tc>
+        <w:tc>
+          <w:tcPr>
+            <w:tcW w:w="1984" w:type="dxa"/>
+          </w:tcPr>
+          <w:p>
+            <w:pPr>
+              <w:jc w:val="center"/>
+            </w:pPr>
+            <w:r>
+              <w:rPr>
+                <w:color w:val="000000"/>
+                <w:szCs w:val="26"/>
+              </w:rPr>
+              <w:t>In/gửi Phiếu tiếp nhận và hẹn trả kết quả</w:t>
+            </w:r>
+          </w:p>
+        </w:tc>
+        <w:tc>
+          <w:tcPr>
+            <w:tcW w:w="1677" w:type="dxa"/>
+          </w:tcPr>
+          <w:p>
+            <w:pPr>
+              <w:jc w:val="center"/>
+            </w:pPr>
+            <w:r>
+              <w:rPr>
+                <w:color w:val="000000"/>
+                <w:szCs w:val="26"/>
+              </w:rPr>
+              <w:t>Overdo</w:t>
+            </w:r>
+          </w:p>
+        </w:tc>
+        <w:tc>
+          <w:tcPr>
+            <w:tcW w:w="1503" w:type="dxa"/>
+          </w:tcPr>
+          <w:p>
+            <w:pPr>
+              <w:jc w:val="center"/>
+            </w:pPr>
+            <w:r>
+              <w:rPr>
+                <w:color w:val="000000"/>
+                <w:szCs w:val="26"/>
+              </w:rPr>
+              <w:t>In giấy không cần thiết</w:t>
+            </w:r>
+          </w:p>
+        </w:tc>
+        <w:tc>
+          <w:tcPr>
+            <w:tcW w:w="1503" w:type="dxa"/>
+          </w:tcPr>
+          <w:p>
+            <w:pPr>
+              <w:jc w:val="center"/>
+            </w:pPr>
+            <w:r>
+              <w:rPr>
+                <w:color w:val="000000"/>
+                <w:szCs w:val="26"/>
+              </w:rPr>
+              <w:t>Có thể in nhiều bản giấy dù phiếu có thể gửi trực tuyến cho người dân.</w:t>
+            </w:r>
+          </w:p>
+        </w:tc>
+        <w:tc>
+          <w:tcPr>
+            <w:tcW w:w="1503" w:type="dxa"/>
+          </w:tcPr>
+          <w:p>
+            <w:pPr>
+              <w:jc w:val="center"/>
+            </w:pPr>
+            <w:r>
+              <w:rPr>
+                <w:color w:val="000000"/>
+                <w:szCs w:val="26"/>
+              </w:rPr>
+              <w:t>Ưu tiên phiếu điện tử; chỉ in giấy khi người dân có nhu cầu.</w:t>
+            </w:r>
+          </w:p>
+        </w:tc>
+      </w:tr>
+      <w:tr>
+        <w:tc>
+          <w:tcPr>
+            <w:tcW w:w="846" w:type="dxa"/>
+          </w:tcPr>
+          <w:p>
+            <w:pPr>
+              <w:jc w:val="center"/>
+            </w:pPr>
+            <w:r>
+              <w:rPr>
+                <w:color w:val="000000"/>
+                <w:szCs w:val="26"/>
+              </w:rPr>
+              <w:t>22</w:t>
+            </w:r>
+          </w:p>
+        </w:tc>
+        <w:tc>
+          <w:tcPr>
+            <w:tcW w:w="1984" w:type="dxa"/>
+          </w:tcPr>
+          <w:p>
+            <w:pPr>
+              <w:jc w:val="center"/>
+            </w:pPr>
+            <w:r>
+              <w:rPr>
+                <w:color w:val="000000"/>
+                <w:szCs w:val="26"/>
+              </w:rPr>
+              <w:t>In Phiếu kiểm soát quá trình xử lý</w:t>
+            </w:r>
+          </w:p>
+        </w:tc>
+        <w:tc>
+          <w:tcPr>
+            <w:tcW w:w="1677" w:type="dxa"/>
+          </w:tcPr>
+          <w:p>
+            <w:pPr>
+              <w:jc w:val="center"/>
+            </w:pPr>
+            <w:r>
+              <w:rPr>
+                <w:color w:val="000000"/>
+                <w:szCs w:val="26"/>
+              </w:rPr>
+              <w:t>Overdo</w:t>
+            </w:r>
+          </w:p>
+        </w:tc>
+        <w:tc>
+          <w:tcPr>
+            <w:tcW w:w="1503" w:type="dxa"/>
+          </w:tcPr>
+          <w:p>
+            <w:pPr>
+              <w:jc w:val="center"/>
+            </w:pPr>
+            <w:r>
+              <w:rPr>
+                <w:color w:val="000000"/>
+                <w:szCs w:val="26"/>
+              </w:rPr>
+              <w:t>In phiếu nội bộ</w:t>
+            </w:r>
+          </w:p>
+        </w:tc>
+        <w:tc>
+          <w:tcPr>
+            <w:tcW w:w="1503" w:type="dxa"/>
+          </w:tcPr>
+          <w:p>
+            <w:pPr>
+              <w:jc w:val="center"/>
+            </w:pPr>
+            <w:r>
+              <w:rPr>
+                <w:color w:val="000000"/>
+                <w:szCs w:val="26"/>
+              </w:rPr>
+              <w:t>Phiếu chủ yếu phục vụ theo dõi nội bộ trong khi hệ thống đã có thể lưu toàn bộ lịch sử xử lý.</w:t>
+            </w:r>
+          </w:p>
+        </w:tc>
+        <w:tc>
+          <w:tcPr>
+            <w:tcW w:w="1503" w:type="dxa"/>
+          </w:tcPr>
+          <w:p>
+            <w:pPr>
+              <w:jc w:val="center"/>
+            </w:pPr>
+            <w:r>
+              <w:rPr>
+                <w:color w:val="000000"/>
+                <w:szCs w:val="26"/>
+              </w:rPr>
+              <w:t>Thay phiếu giấy bằng chức năng theo dõi điện tử.</w:t>
+            </w:r>
+          </w:p>
+        </w:tc>
+      </w:tr>
+    </w:tbl>
+    <w:p/>
+    <w:p>
       <w:pPr>
         <w:pStyle w:val="Heading3"/>
       </w:pPr>
@@ -17738,6 +20271,7 @@
       <w:bookmarkStart w:id="56" w:name="_Toc236264133"/>
       <w:bookmarkStart w:id="57" w:name="_Toc237027021"/>
       <w:r>
+        <w:lastRenderedPageBreak/>
         <w:t xml:space="preserve">Chương IV. </w:t>
       </w:r>
       <w:r>
@@ -17793,62 +20327,6 @@
       </w:r>
       <w:bookmarkEnd w:id="58"/>
       <w:bookmarkEnd w:id="59"/>
-    </w:p>
-    <w:p>
-      <w:pPr>
-        <w:pStyle w:val="ListParagraph"/>
-        <w:numPr>
-          <w:ilvl w:val="0"/>
-          <w:numId w:val="6"/>
-        </w:numPr>
-        <w:jc w:val="both"/>
-      </w:pPr>
-      <w:hyperlink r:id="rId19" w:anchor="ID0EBBF=Getting_started" w:history="1">
-        <w:r>
-          <w:rPr>
-            <w:rStyle w:val="Hyperlink"/>
-          </w:rPr>
-          <w:t>Write great papers with Microsoft Word - Microsoft Support</w:t>
-        </w:r>
-      </w:hyperlink>
-      <w:r>
-        <w:t xml:space="preserve"> (nếu chỉ tham khảo ở một website nào đó).</w:t>
-      </w:r>
-    </w:p>
-    <w:p>
-      <w:pPr>
-        <w:pStyle w:val="ListParagraph"/>
-        <w:numPr>
-          <w:ilvl w:val="0"/>
-          <w:numId w:val="6"/>
-        </w:numPr>
-        <w:jc w:val="both"/>
-      </w:pPr>
-      <w:r>
-        <w:t>J. Kim, C. Ko, A. Frenzel, S. Ramanathan, and J. E. Homan, Nanoscale imaging and control of resistance switching in VO2 at room temperature, Applied Physics Letters 96, 213106 (2010) (nếu tham khảo các nghiên cứu, bài báo khoa học).</w:t>
-      </w:r>
-    </w:p>
-    <w:p>
-      <w:pPr>
-        <w:pStyle w:val="ListParagraph"/>
-        <w:numPr>
-          <w:ilvl w:val="0"/>
-          <w:numId w:val="6"/>
-        </w:numPr>
-        <w:jc w:val="both"/>
-      </w:pPr>
-      <w:r>
-        <w:t>Giáo trình</w:t>
-      </w:r>
-      <w:r>
-        <w:t xml:space="preserve"> môn học</w:t>
-      </w:r>
-      <w:r>
-        <w:t xml:space="preserve"> </w:t>
-      </w:r>
-      <w:r>
-        <w:t>&lt;Tên môn học&gt; (nếu tham khảo chủ yếu trong slide bài giảng môn học).</w:t>
-      </w:r>
     </w:p>
     <w:p>
       <w:pPr>
@@ -17868,16 +20346,7 @@
         </w:r>
       </w:hyperlink>
       <w:r>
-        <w:t xml:space="preserve"> </w:t>
-      </w:r>
-      <w:r>
-        <w:t>(nếu chỉ tham khảo ở một website nào</w:t>
-      </w:r>
-      <w:r>
-        <w:t xml:space="preserve"> đó</w:t>
-      </w:r>
-      <w:r>
-        <w:t>).</w:t>
+        <w:t xml:space="preserve"> (nếu chỉ tham khảo ở một website nào đó).</w:t>
       </w:r>
     </w:p>
     <w:p>
@@ -17890,19 +20359,7 @@
         <w:jc w:val="both"/>
       </w:pPr>
       <w:r>
-        <w:t>J. Kim, C. Ko, A. Frenzel, S. Ramanathan, and J. E. Homan, Nanoscale imaging and control of resistance switching in VO2 at room temperature, Applied Physics Letters 96, 213106 (2010)</w:t>
-      </w:r>
-      <w:r>
-        <w:t xml:space="preserve"> (nếu tham khảo</w:t>
-      </w:r>
-      <w:r>
-        <w:t xml:space="preserve"> các</w:t>
-      </w:r>
-      <w:r>
-        <w:t xml:space="preserve"> nghiên cứu, bài báo khoa học</w:t>
-      </w:r>
-      <w:r>
-        <w:t>).</w:t>
+        <w:t>J. Kim, C. Ko, A. Frenzel, S. Ramanathan, and J. E. Homan, Nanoscale imaging and control of resistance switching in VO2 at room temperature, Applied Physics Letters 96, 213106 (2010) (nếu tham khảo các nghiên cứu, bài báo khoa học).</w:t>
       </w:r>
     </w:p>
     <w:p>
@@ -17924,6 +20381,83 @@
         <w:t xml:space="preserve"> </w:t>
       </w:r>
       <w:r>
+        <w:t>&lt;Tên môn học&gt; (nếu tham khảo chủ yếu trong slide bài giảng môn học).</w:t>
+      </w:r>
+    </w:p>
+    <w:p>
+      <w:pPr>
+        <w:pStyle w:val="ListParagraph"/>
+        <w:numPr>
+          <w:ilvl w:val="0"/>
+          <w:numId w:val="6"/>
+        </w:numPr>
+        <w:jc w:val="both"/>
+      </w:pPr>
+      <w:hyperlink r:id="rId21" w:anchor="ID0EBBF=Getting_started" w:history="1">
+        <w:r>
+          <w:rPr>
+            <w:rStyle w:val="Hyperlink"/>
+          </w:rPr>
+          <w:t>Write great papers with Microsoft Word - Microsoft Support</w:t>
+        </w:r>
+      </w:hyperlink>
+      <w:r>
+        <w:t xml:space="preserve"> </w:t>
+      </w:r>
+      <w:r>
+        <w:t>(nếu chỉ tham khảo ở một website nào</w:t>
+      </w:r>
+      <w:r>
+        <w:t xml:space="preserve"> đó</w:t>
+      </w:r>
+      <w:r>
+        <w:t>).</w:t>
+      </w:r>
+    </w:p>
+    <w:p>
+      <w:pPr>
+        <w:pStyle w:val="ListParagraph"/>
+        <w:numPr>
+          <w:ilvl w:val="0"/>
+          <w:numId w:val="6"/>
+        </w:numPr>
+        <w:jc w:val="both"/>
+      </w:pPr>
+      <w:r>
+        <w:t>J. Kim, C. Ko, A. Frenzel, S. Ramanathan, and J. E. Homan, Nanoscale imaging and control of resistance switching in VO2 at room temperature, Applied Physics Letters 96, 213106 (2010)</w:t>
+      </w:r>
+      <w:r>
+        <w:t xml:space="preserve"> (nếu tham khảo</w:t>
+      </w:r>
+      <w:r>
+        <w:t xml:space="preserve"> các</w:t>
+      </w:r>
+      <w:r>
+        <w:t xml:space="preserve"> nghiên cứu, bài báo khoa học</w:t>
+      </w:r>
+      <w:r>
+        <w:t>).</w:t>
+      </w:r>
+    </w:p>
+    <w:p>
+      <w:pPr>
+        <w:pStyle w:val="ListParagraph"/>
+        <w:numPr>
+          <w:ilvl w:val="0"/>
+          <w:numId w:val="6"/>
+        </w:numPr>
+        <w:jc w:val="both"/>
+      </w:pPr>
+      <w:r>
+        <w:t>Giáo trình</w:t>
+      </w:r>
+      <w:r>
+        <w:t xml:space="preserve"> môn học</w:t>
+      </w:r>
+      <w:r>
+        <w:t xml:space="preserve"> </w:t>
+      </w:r>
+      <w:r>
         <w:t>&lt;Tên môn học&gt;</w:t>
       </w:r>
       <w:r>
@@ -17933,8 +20467,8 @@
     <w:p/>
     <w:p/>
     <w:sectPr>
-      <w:headerReference w:type="default" r:id="rId21"/>
-      <w:footerReference w:type="default" r:id="rId22"/>
+      <w:headerReference w:type="default" r:id="rId22"/>
+      <w:footerReference w:type="default" r:id="rId23"/>
       <w:pgSz w:w="11906" w:h="16838" w:code="9"/>
       <w:pgMar w:top="1440" w:right="1440" w:bottom="1440" w:left="1440" w:header="720" w:footer="720" w:gutter="0"/>
       <w:pgBorders w:display="firstPage" w:offsetFrom="page">

</xml_diff>